<commit_message>
Restore full Lab14 prompt text in final Rmd/docx
</commit_message>
<xml_diff>
--- a/Lab14/lab14_output/lab_14_final.docx
+++ b/Lab14/lab14_output/lab_14_final.docx
@@ -64,6 +64,131 @@
     </w:p>
     <w:p>
       <w:pPr>
+        <w:pStyle w:val="FirstParagraph"/>
+      </w:pPr>
+      <w:r>
+        <w:t xml:space="preserve">Preliminaries. Install and load into memory these packages:</w:t>
+      </w:r>
+      <w:r>
+        <w:t xml:space="preserve"> </w:t>
+      </w:r>
+      <w:r>
+        <w:rPr>
+          <w:rStyle w:val="VerbatimChar"/>
+        </w:rPr>
+        <w:t xml:space="preserve">haven</w:t>
+      </w:r>
+      <w:r>
+        <w:t xml:space="preserve"> </w:t>
+      </w:r>
+      <w:r>
+        <w:t xml:space="preserve">(you will not use any</w:t>
+      </w:r>
+      <w:r>
+        <w:t xml:space="preserve"> </w:t>
+      </w:r>
+      <w:r>
+        <w:rPr>
+          <w:rStyle w:val="VerbatimChar"/>
+        </w:rPr>
+        <w:t xml:space="preserve">haven</w:t>
+      </w:r>
+      <w:r>
+        <w:t xml:space="preserve"> </w:t>
+      </w:r>
+      <w:r>
+        <w:t xml:space="preserve">functions, but you will read in a</w:t>
+      </w:r>
+      <w:r>
+        <w:t xml:space="preserve"> </w:t>
+      </w:r>
+      <w:r>
+        <w:rPr>
+          <w:rStyle w:val="VerbatimChar"/>
+        </w:rPr>
+        <w:t xml:space="preserve">haven</w:t>
+      </w:r>
+      <w:r>
+        <w:t xml:space="preserve">-formatted dataframe and so it is good to have the package loaded);</w:t>
+      </w:r>
+      <w:r>
+        <w:t xml:space="preserve"> </w:t>
+      </w:r>
+      <w:r>
+        <w:rPr>
+          <w:rStyle w:val="VerbatimChar"/>
+        </w:rPr>
+        <w:t xml:space="preserve">ggplot2</w:t>
+      </w:r>
+      <w:r>
+        <w:t xml:space="preserve"> </w:t>
+      </w:r>
+      <w:r>
+        <w:t xml:space="preserve">(to make graphs);</w:t>
+      </w:r>
+      <w:r>
+        <w:t xml:space="preserve"> </w:t>
+      </w:r>
+      <w:r>
+        <w:rPr>
+          <w:rStyle w:val="VerbatimChar"/>
+        </w:rPr>
+        <w:t xml:space="preserve">labelled</w:t>
+      </w:r>
+      <w:r>
+        <w:t xml:space="preserve"> </w:t>
+      </w:r>
+      <w:r>
+        <w:t xml:space="preserve">(to view variable labels);</w:t>
+      </w:r>
+      <w:r>
+        <w:t xml:space="preserve"> </w:t>
+      </w:r>
+      <w:r>
+        <w:rPr>
+          <w:rStyle w:val="VerbatimChar"/>
+        </w:rPr>
+        <w:t xml:space="preserve">psych</w:t>
+      </w:r>
+      <w:r>
+        <w:t xml:space="preserve"> </w:t>
+      </w:r>
+      <w:r>
+        <w:t xml:space="preserve">(we will use the</w:t>
+      </w:r>
+      <w:r>
+        <w:t xml:space="preserve"> </w:t>
+      </w:r>
+      <w:r>
+        <w:rPr>
+          <w:rStyle w:val="VerbatimChar"/>
+        </w:rPr>
+        <w:t xml:space="preserve">describe</w:t>
+      </w:r>
+      <w:r>
+        <w:t xml:space="preserve"> </w:t>
+      </w:r>
+      <w:r>
+        <w:t xml:space="preserve">function for descriptives); and</w:t>
+      </w:r>
+      <w:r>
+        <w:t xml:space="preserve"> </w:t>
+      </w:r>
+      <w:r>
+        <w:rPr>
+          <w:rStyle w:val="VerbatimChar"/>
+        </w:rPr>
+        <w:t xml:space="preserve">stargazer</w:t>
+      </w:r>
+      <w:r>
+        <w:t xml:space="preserve"> </w:t>
+      </w:r>
+      <w:r>
+        <w:t xml:space="preserve">(to put your regression results into nicely formatted tables).</w:t>
+      </w:r>
+    </w:p>
+    <w:p>
+      <w:pPr>
         <w:pStyle w:val="SourceCode"/>
       </w:pPr>
       <w:r>
@@ -349,6 +474,29 @@
     </w:p>
     <w:p>
       <w:pPr>
+        <w:pStyle w:val="FirstParagraph"/>
+      </w:pPr>
+      <w:r>
+        <w:t xml:space="preserve">Load the</w:t>
+      </w:r>
+      <w:r>
+        <w:t xml:space="preserve"> </w:t>
+      </w:r>
+      <w:r>
+        <w:rPr>
+          <w:rStyle w:val="VerbatimChar"/>
+        </w:rPr>
+        <w:t xml:space="preserve">ecls.rda</w:t>
+      </w:r>
+      <w:r>
+        <w:t xml:space="preserve"> </w:t>
+      </w:r>
+      <w:r>
+        <w:t xml:space="preserve">datafile.</w:t>
+      </w:r>
+    </w:p>
+    <w:p>
+      <w:pPr>
         <w:pStyle w:val="SourceCode"/>
       </w:pPr>
       <w:r>
@@ -522,6 +670,14 @@
     </w:p>
     <w:p>
       <w:pPr>
+        <w:pStyle w:val="FirstParagraph"/>
+      </w:pPr>
+      <w:r>
+        <w:t xml:space="preserve">Ask R to produce the variable labels for all labels.</w:t>
+      </w:r>
+    </w:p>
+    <w:p>
+      <w:pPr>
         <w:pStyle w:val="SourceCode"/>
       </w:pPr>
       <w:r>
@@ -860,6 +1016,14 @@
     </w:p>
     <w:p>
       <w:pPr>
+        <w:pStyle w:val="FirstParagraph"/>
+      </w:pPr>
+      <w:r>
+        <w:t xml:space="preserve">Create z-standardized versions of the reading score, family income, and # of children in the household variables. Do NOT overwrite the original variables.</w:t>
+      </w:r>
+    </w:p>
+    <w:p>
+      <w:pPr>
         <w:pStyle w:val="SourceCode"/>
       </w:pPr>
       <w:r>
@@ -1240,6 +1404,14 @@
     </w:p>
     <w:p>
       <w:pPr>
+        <w:pStyle w:val="FirstParagraph"/>
+      </w:pPr>
+      <w:r>
+        <w:t xml:space="preserve">Create a new variable that is family income (which is originally in dollars) rescaled so it is in thousands.</w:t>
+      </w:r>
+    </w:p>
+    <w:p>
+      <w:pPr>
         <w:pStyle w:val="SourceCode"/>
       </w:pPr>
       <w:r>
@@ -1315,6 +1487,14 @@
     </w:p>
     <w:p>
       <w:pPr>
+        <w:pStyle w:val="FirstParagraph"/>
+      </w:pPr>
+      <w:r>
+        <w:t xml:space="preserve">Create a subsetted dataframe containing the childid, reading score (original and z-standardized), income (rescaled and z-standardized), # of kids (original and z-standardized) variables. The dataframe should only consist of subjects with complete information on these variables.</w:t>
+      </w:r>
+    </w:p>
+    <w:p>
+      <w:pPr>
         <w:pStyle w:val="SourceCode"/>
       </w:pPr>
       <w:r>
@@ -1701,6 +1881,14 @@
     </w:p>
     <w:p>
       <w:pPr>
+        <w:pStyle w:val="FirstParagraph"/>
+      </w:pPr>
+      <w:r>
+        <w:t xml:space="preserve">Get the number of cases in the original ECLS data frame and the number of cases you get after deleting cases with missing values. What is the number of cases dropped?</w:t>
+      </w:r>
+    </w:p>
+    <w:p>
+      <w:pPr>
         <w:pStyle w:val="SourceCode"/>
       </w:pPr>
       <w:r>
@@ -1819,6 +2007,29 @@
     </w:p>
     <w:p>
       <w:pPr>
+        <w:pStyle w:val="FirstParagraph"/>
+      </w:pPr>
+      <w:r>
+        <w:t xml:space="preserve">To be safe, remove the original</w:t>
+      </w:r>
+      <w:r>
+        <w:t xml:space="preserve"> </w:t>
+      </w:r>
+      <w:r>
+        <w:rPr>
+          <w:rStyle w:val="VerbatimChar"/>
+        </w:rPr>
+        <w:t xml:space="preserve">ecls</w:t>
+      </w:r>
+      <w:r>
+        <w:t xml:space="preserve"> </w:t>
+      </w:r>
+      <w:r>
+        <w:t xml:space="preserve">dataframe from your R workspace.</w:t>
+      </w:r>
+    </w:p>
+    <w:p>
+      <w:pPr>
         <w:pStyle w:val="SourceCode"/>
       </w:pPr>
       <w:r>
@@ -1868,6 +2079,14 @@
       </w:pPr>
       <w:r>
         <w:t xml:space="preserve">Problem 9 (6 pts)</w:t>
+      </w:r>
+    </w:p>
+    <w:p>
+      <w:pPr>
+        <w:pStyle w:val="FirstParagraph"/>
+      </w:pPr>
+      <w:r>
+        <w:t xml:space="preserve">Construct a histogram of the distribution of the test score, income, and # of children variables (use the original variables). The histograms should show percentages and have clear axis labels.</w:t>
       </w:r>
     </w:p>
     <w:p>
@@ -2982,6 +3201,14 @@
     </w:p>
     <w:p>
       <w:pPr>
+        <w:pStyle w:val="FirstParagraph"/>
+      </w:pPr>
+      <w:r>
+        <w:t xml:space="preserve">Run separate bivariate regressions of test score (dependent variable) on family income (in $1,000s) and number of children in the household. Do NOT use the z-standardized versions of the variables. Store the results in separate objects.</w:t>
+      </w:r>
+    </w:p>
+    <w:p>
+      <w:pPr>
         <w:pStyle w:val="SourceCode"/>
       </w:pPr>
       <w:r>
@@ -3468,6 +3695,91 @@
     </w:p>
     <w:p>
       <w:pPr>
+        <w:pStyle w:val="FirstParagraph"/>
+      </w:pPr>
+      <w:r>
+        <w:t xml:space="preserve">Use</w:t>
+      </w:r>
+      <w:r>
+        <w:t xml:space="preserve"> </w:t>
+      </w:r>
+      <w:r>
+        <w:rPr>
+          <w:rStyle w:val="VerbatimChar"/>
+        </w:rPr>
+        <w:t xml:space="preserve">stargazer</w:t>
+      </w:r>
+      <w:r>
+        <w:t xml:space="preserve"> </w:t>
+      </w:r>
+      <w:r>
+        <w:t xml:space="preserve">to present the results for both models in one table. Your table should have clear labels for the dependent variable and the predictors. The units of measurement of both the predictors and outcome should be clear. You should NOT use the default presentation of a single star representing marginal (</w:t>
+      </w:r>
+      <w:r>
+        <w:rPr>
+          <w:rStyle w:val="VerbatimChar"/>
+        </w:rPr>
+        <w:t xml:space="preserve">p &lt; .10</w:t>
+      </w:r>
+      <w:r>
+        <w:t xml:space="preserve">) significance.</w:t>
+      </w:r>
+    </w:p>
+    <w:p>
+      <w:pPr>
+        <w:pStyle w:val="BodyText"/>
+      </w:pPr>
+      <w:r>
+        <w:t xml:space="preserve">Here is some</w:t>
+      </w:r>
+      <w:r>
+        <w:t xml:space="preserve"> </w:t>
+      </w:r>
+      <w:r>
+        <w:rPr>
+          <w:rStyle w:val="VerbatimChar"/>
+        </w:rPr>
+        <w:t xml:space="preserve">stargazer</w:t>
+      </w:r>
+      <w:r>
+        <w:t xml:space="preserve"> </w:t>
+      </w:r>
+      <w:r>
+        <w:t xml:space="preserve">syntax you may find helpful. I recommend running</w:t>
+      </w:r>
+      <w:r>
+        <w:t xml:space="preserve"> </w:t>
+      </w:r>
+      <w:r>
+        <w:rPr>
+          <w:rStyle w:val="VerbatimChar"/>
+        </w:rPr>
+        <w:t xml:space="preserve">stargazer</w:t>
+      </w:r>
+      <w:r>
+        <w:t xml:space="preserve"> </w:t>
+      </w:r>
+      <w:r>
+        <w:t xml:space="preserve">using just the</w:t>
+      </w:r>
+      <w:r>
+        <w:t xml:space="preserve"> </w:t>
+      </w:r>
+      <w:r>
+        <w:rPr>
+          <w:rStyle w:val="VerbatimChar"/>
+        </w:rPr>
+        <w:t xml:space="preserve">type = "text"</w:t>
+      </w:r>
+      <w:r>
+        <w:t xml:space="preserve"> </w:t>
+      </w:r>
+      <w:r>
+        <w:t xml:space="preserve">option and then adding options one at a time to see how they affect your table.</w:t>
+      </w:r>
+    </w:p>
+    <w:p>
+      <w:pPr>
         <w:pStyle w:val="SourceCode"/>
       </w:pPr>
       <w:r>
@@ -4187,6 +4499,14 @@
         <w:pStyle w:val="FirstParagraph"/>
       </w:pPr>
       <w:r>
+        <w:t xml:space="preserve">Give a textbook interpretation of the intercept in both models. Your interpretation should make clear the units of measurement.</w:t>
+      </w:r>
+    </w:p>
+    <w:p>
+      <w:pPr>
+        <w:pStyle w:val="BodyText"/>
+      </w:pPr>
+      <w:r>
         <w:t xml:space="preserve">Model 1 (income): When family income is $0, the predicted spring kindergarten reading score is 48.699 points.</w:t>
       </w:r>
     </w:p>
@@ -4213,6 +4533,14 @@
         <w:pStyle w:val="FirstParagraph"/>
       </w:pPr>
       <w:r>
+        <w:t xml:space="preserve">Give a textbook interpretation of the slope in both models. Your interpretation should make clear the units of measurement.</w:t>
+      </w:r>
+    </w:p>
+    <w:p>
+      <w:pPr>
+        <w:pStyle w:val="BodyText"/>
+      </w:pPr>
+      <w:r>
         <w:t xml:space="preserve">Model 1 (income): For each additional $1,000 of family income, predicted reading score increases by 0.0399 points,</w:t>
       </w:r>
       <w:r>
@@ -4287,6 +4615,29 @@
         <w:pStyle w:val="FirstParagraph"/>
       </w:pPr>
       <w:r>
+        <w:t xml:space="preserve">Give a textbook interpretation of the</w:t>
+      </w:r>
+      <w:r>
+        <w:t xml:space="preserve"> </w:t>
+      </w:r>
+      <w:r>
+        <w:rPr>
+          <w:rStyle w:val="VerbatimChar"/>
+        </w:rPr>
+        <w:t xml:space="preserve">R^2</w:t>
+      </w:r>
+      <w:r>
+        <w:t xml:space="preserve"> </w:t>
+      </w:r>
+      <w:r>
+        <w:t xml:space="preserve">in both models.</w:t>
+      </w:r>
+    </w:p>
+    <w:p>
+      <w:pPr>
+        <w:pStyle w:val="BodyText"/>
+      </w:pPr>
+      <w:r>
         <w:t xml:space="preserve">Model 1 (income):</w:t>
       </w:r>
       <w:r>
@@ -4334,6 +4685,14 @@
     </w:p>
     <w:p>
       <w:pPr>
+        <w:pStyle w:val="FirstParagraph"/>
+      </w:pPr>
+      <w:r>
+        <w:t xml:space="preserve">Re-do the models, but this time make all variables be z-standardized.</w:t>
+      </w:r>
+    </w:p>
+    <w:p>
+      <w:pPr>
         <w:pStyle w:val="SourceCode"/>
       </w:pPr>
       <w:r>
@@ -4820,6 +5179,29 @@
     </w:p>
     <w:p>
       <w:pPr>
+        <w:pStyle w:val="FirstParagraph"/>
+      </w:pPr>
+      <w:r>
+        <w:t xml:space="preserve">Re-do your</w:t>
+      </w:r>
+      <w:r>
+        <w:t xml:space="preserve"> </w:t>
+      </w:r>
+      <w:r>
+        <w:rPr>
+          <w:rStyle w:val="VerbatimChar"/>
+        </w:rPr>
+        <w:t xml:space="preserve">stargazer</w:t>
+      </w:r>
+      <w:r>
+        <w:t xml:space="preserve"> </w:t>
+      </w:r>
+      <w:r>
+        <w:t xml:space="preserve">table with the new models. Your table should make clear the units of measurement (SD).</w:t>
+      </w:r>
+    </w:p>
+    <w:p>
+      <w:pPr>
         <w:pStyle w:val="SourceCode"/>
       </w:pPr>
       <w:r>
@@ -5539,6 +5921,14 @@
         <w:pStyle w:val="FirstParagraph"/>
       </w:pPr>
       <w:r>
+        <w:t xml:space="preserve">Give a textbook interpretation for the intercept for the model where # of children in the household is the predictor.</w:t>
+      </w:r>
+    </w:p>
+    <w:p>
+      <w:pPr>
+        <w:pStyle w:val="BodyText"/>
+      </w:pPr>
+      <w:r>
         <w:t xml:space="preserve">In the z-standardized children model, when the number of household members under 18 is at the sample mean (</w:t>
       </w:r>
       <w:r>
@@ -5566,6 +5956,14 @@
         <w:pStyle w:val="FirstParagraph"/>
       </w:pPr>
       <w:r>
+        <w:t xml:space="preserve">Give a textbook interpretation for the slope for the model where # of children in the household is the predictor.</w:t>
+      </w:r>
+    </w:p>
+    <w:p>
+      <w:pPr>
+        <w:pStyle w:val="BodyText"/>
+      </w:pPr>
+      <w:r>
         <w:t xml:space="preserve">In the z-standardized children model, a 1 SD increase in number of household members under 18 predicts a 0.162 SD decrease in reading scores,</w:t>
       </w:r>
       <w:r>
@@ -5605,6 +6003,14 @@
     </w:p>
     <w:p>
       <w:pPr>
+        <w:pStyle w:val="FirstParagraph"/>
+      </w:pPr>
+      <w:r>
+        <w:t xml:space="preserve">Ask R to report summaries of the model objects so you can get the p values for the slopes (it does not matter if you use a model using the raw metrics or the z-standardized variables).</w:t>
+      </w:r>
+    </w:p>
+    <w:p>
+      <w:pPr>
         <w:pStyle w:val="SourceCode"/>
       </w:pPr>
       <w:r>
@@ -5978,6 +6384,14 @@
     <w:p>
       <w:pPr>
         <w:pStyle w:val="FirstParagraph"/>
+      </w:pPr>
+      <w:r>
+        <w:t xml:space="preserve">In ONE sentence, write up the results of both regressions in APA style.</w:t>
+      </w:r>
+    </w:p>
+    <w:p>
+      <w:pPr>
+        <w:pStyle w:val="BodyText"/>
       </w:pPr>
       <w:r>
         <w:t xml:space="preserve">In separate bivariate regressions, spring kindergarten reading scores were positively associated with family income (in $1,000s),</w:t>

</xml_diff>

<commit_message>
Make Lab14 final explicitly show syntax and output per problem
</commit_message>
<xml_diff>
--- a/Lab14/lab14_output/lab_14_final.docx
+++ b/Lab14/lab14_output/lab_14_final.docx
@@ -189,6 +189,14 @@
     </w:p>
     <w:p>
       <w:pPr>
+        <w:pStyle w:val="BodyText"/>
+      </w:pPr>
+      <w:r>
+        <w:t xml:space="preserve">Syntax + Output:</w:t>
+      </w:r>
+    </w:p>
+    <w:p>
+      <w:pPr>
         <w:pStyle w:val="SourceCode"/>
       </w:pPr>
       <w:r>
@@ -497,6 +505,14 @@
     </w:p>
     <w:p>
       <w:pPr>
+        <w:pStyle w:val="BodyText"/>
+      </w:pPr>
+      <w:r>
+        <w:t xml:space="preserve">Syntax + Output:</w:t>
+      </w:r>
+    </w:p>
+    <w:p>
+      <w:pPr>
         <w:pStyle w:val="SourceCode"/>
       </w:pPr>
       <w:r>
@@ -678,6 +694,14 @@
     </w:p>
     <w:p>
       <w:pPr>
+        <w:pStyle w:val="BodyText"/>
+      </w:pPr>
+      <w:r>
+        <w:t xml:space="preserve">Syntax + Output:</w:t>
+      </w:r>
+    </w:p>
+    <w:p>
+      <w:pPr>
         <w:pStyle w:val="SourceCode"/>
       </w:pPr>
       <w:r>
@@ -1024,6 +1048,14 @@
     </w:p>
     <w:p>
       <w:pPr>
+        <w:pStyle w:val="BodyText"/>
+      </w:pPr>
+      <w:r>
+        <w:t xml:space="preserve">Syntax + Output:</w:t>
+      </w:r>
+    </w:p>
+    <w:p>
+      <w:pPr>
         <w:pStyle w:val="SourceCode"/>
       </w:pPr>
       <w:r>
@@ -1412,6 +1444,14 @@
     </w:p>
     <w:p>
       <w:pPr>
+        <w:pStyle w:val="BodyText"/>
+      </w:pPr>
+      <w:r>
+        <w:t xml:space="preserve">Syntax + Output:</w:t>
+      </w:r>
+    </w:p>
+    <w:p>
+      <w:pPr>
         <w:pStyle w:val="SourceCode"/>
       </w:pPr>
       <w:r>
@@ -1495,6 +1535,14 @@
     </w:p>
     <w:p>
       <w:pPr>
+        <w:pStyle w:val="BodyText"/>
+      </w:pPr>
+      <w:r>
+        <w:t xml:space="preserve">Syntax + Output:</w:t>
+      </w:r>
+    </w:p>
+    <w:p>
+      <w:pPr>
         <w:pStyle w:val="SourceCode"/>
       </w:pPr>
       <w:r>
@@ -1889,6 +1937,14 @@
     </w:p>
     <w:p>
       <w:pPr>
+        <w:pStyle w:val="BodyText"/>
+      </w:pPr>
+      <w:r>
+        <w:t xml:space="preserve">Syntax + Output:</w:t>
+      </w:r>
+    </w:p>
+    <w:p>
+      <w:pPr>
         <w:pStyle w:val="SourceCode"/>
       </w:pPr>
       <w:r>
@@ -2030,6 +2086,14 @@
     </w:p>
     <w:p>
       <w:pPr>
+        <w:pStyle w:val="BodyText"/>
+      </w:pPr>
+      <w:r>
+        <w:t xml:space="preserve">Syntax + Output:</w:t>
+      </w:r>
+    </w:p>
+    <w:p>
+      <w:pPr>
         <w:pStyle w:val="SourceCode"/>
       </w:pPr>
       <w:r>
@@ -2087,6 +2151,14 @@
       </w:pPr>
       <w:r>
         <w:t xml:space="preserve">Construct a histogram of the distribution of the test score, income, and # of children variables (use the original variables). The histograms should show percentages and have clear axis labels.</w:t>
+      </w:r>
+    </w:p>
+    <w:p>
+      <w:pPr>
+        <w:pStyle w:val="BodyText"/>
+      </w:pPr>
+      <w:r>
+        <w:t xml:space="preserve">Syntax + Output:</w:t>
       </w:r>
     </w:p>
     <w:p>
@@ -3209,6 +3281,14 @@
     </w:p>
     <w:p>
       <w:pPr>
+        <w:pStyle w:val="BodyText"/>
+      </w:pPr>
+      <w:r>
+        <w:t xml:space="preserve">Syntax + Output:</w:t>
+      </w:r>
+    </w:p>
+    <w:p>
+      <w:pPr>
         <w:pStyle w:val="SourceCode"/>
       </w:pPr>
       <w:r>
@@ -3780,6 +3860,14 @@
     </w:p>
     <w:p>
       <w:pPr>
+        <w:pStyle w:val="BodyText"/>
+      </w:pPr>
+      <w:r>
+        <w:t xml:space="preserve">Syntax + Output:</w:t>
+      </w:r>
+    </w:p>
+    <w:p>
+      <w:pPr>
         <w:pStyle w:val="SourceCode"/>
       </w:pPr>
       <w:r>
@@ -4693,6 +4781,14 @@
     </w:p>
     <w:p>
       <w:pPr>
+        <w:pStyle w:val="BodyText"/>
+      </w:pPr>
+      <w:r>
+        <w:t xml:space="preserve">Syntax + Output:</w:t>
+      </w:r>
+    </w:p>
+    <w:p>
+      <w:pPr>
         <w:pStyle w:val="SourceCode"/>
       </w:pPr>
       <w:r>
@@ -5202,6 +5298,14 @@
     </w:p>
     <w:p>
       <w:pPr>
+        <w:pStyle w:val="BodyText"/>
+      </w:pPr>
+      <w:r>
+        <w:t xml:space="preserve">Syntax + Output:</w:t>
+      </w:r>
+    </w:p>
+    <w:p>
+      <w:pPr>
         <w:pStyle w:val="SourceCode"/>
       </w:pPr>
       <w:r>
@@ -6007,6 +6111,14 @@
       </w:pPr>
       <w:r>
         <w:t xml:space="preserve">Ask R to report summaries of the model objects so you can get the p values for the slopes (it does not matter if you use a model using the raw metrics or the z-standardized variables).</w:t>
+      </w:r>
+    </w:p>
+    <w:p>
+      <w:pPr>
+        <w:pStyle w:val="BodyText"/>
+      </w:pPr>
+      <w:r>
+        <w:t xml:space="preserve">Syntax + Output:</w:t>
       </w:r>
     </w:p>
     <w:p>

</xml_diff>

<commit_message>
Label Lab14 final sections as Syntax and Output
</commit_message>
<xml_diff>
--- a/Lab14/lab14_output/lab_14_final.docx
+++ b/Lab14/lab14_output/lab_14_final.docx
@@ -192,7 +192,15 @@
         <w:pStyle w:val="BodyText"/>
       </w:pPr>
       <w:r>
-        <w:t xml:space="preserve">Syntax + Output:</w:t>
+        <w:t xml:space="preserve">Syntax:</w:t>
+      </w:r>
+    </w:p>
+    <w:p>
+      <w:pPr>
+        <w:pStyle w:val="BodyText"/>
+      </w:pPr>
+      <w:r>
+        <w:t xml:space="preserve">Output:</w:t>
       </w:r>
     </w:p>
     <w:p>
@@ -508,7 +516,15 @@
         <w:pStyle w:val="BodyText"/>
       </w:pPr>
       <w:r>
-        <w:t xml:space="preserve">Syntax + Output:</w:t>
+        <w:t xml:space="preserve">Syntax:</w:t>
+      </w:r>
+    </w:p>
+    <w:p>
+      <w:pPr>
+        <w:pStyle w:val="BodyText"/>
+      </w:pPr>
+      <w:r>
+        <w:t xml:space="preserve">Output:</w:t>
       </w:r>
     </w:p>
     <w:p>
@@ -697,7 +713,15 @@
         <w:pStyle w:val="BodyText"/>
       </w:pPr>
       <w:r>
-        <w:t xml:space="preserve">Syntax + Output:</w:t>
+        <w:t xml:space="preserve">Syntax:</w:t>
+      </w:r>
+    </w:p>
+    <w:p>
+      <w:pPr>
+        <w:pStyle w:val="BodyText"/>
+      </w:pPr>
+      <w:r>
+        <w:t xml:space="preserve">Output:</w:t>
       </w:r>
     </w:p>
     <w:p>
@@ -1051,7 +1075,15 @@
         <w:pStyle w:val="BodyText"/>
       </w:pPr>
       <w:r>
-        <w:t xml:space="preserve">Syntax + Output:</w:t>
+        <w:t xml:space="preserve">Syntax:</w:t>
+      </w:r>
+    </w:p>
+    <w:p>
+      <w:pPr>
+        <w:pStyle w:val="BodyText"/>
+      </w:pPr>
+      <w:r>
+        <w:t xml:space="preserve">Output:</w:t>
       </w:r>
     </w:p>
     <w:p>
@@ -1447,7 +1479,15 @@
         <w:pStyle w:val="BodyText"/>
       </w:pPr>
       <w:r>
-        <w:t xml:space="preserve">Syntax + Output:</w:t>
+        <w:t xml:space="preserve">Syntax:</w:t>
+      </w:r>
+    </w:p>
+    <w:p>
+      <w:pPr>
+        <w:pStyle w:val="BodyText"/>
+      </w:pPr>
+      <w:r>
+        <w:t xml:space="preserve">Output:</w:t>
       </w:r>
     </w:p>
     <w:p>
@@ -1538,7 +1578,15 @@
         <w:pStyle w:val="BodyText"/>
       </w:pPr>
       <w:r>
-        <w:t xml:space="preserve">Syntax + Output:</w:t>
+        <w:t xml:space="preserve">Syntax:</w:t>
+      </w:r>
+    </w:p>
+    <w:p>
+      <w:pPr>
+        <w:pStyle w:val="BodyText"/>
+      </w:pPr>
+      <w:r>
+        <w:t xml:space="preserve">Output:</w:t>
       </w:r>
     </w:p>
     <w:p>
@@ -1940,7 +1988,15 @@
         <w:pStyle w:val="BodyText"/>
       </w:pPr>
       <w:r>
-        <w:t xml:space="preserve">Syntax + Output:</w:t>
+        <w:t xml:space="preserve">Syntax:</w:t>
+      </w:r>
+    </w:p>
+    <w:p>
+      <w:pPr>
+        <w:pStyle w:val="BodyText"/>
+      </w:pPr>
+      <w:r>
+        <w:t xml:space="preserve">Output:</w:t>
       </w:r>
     </w:p>
     <w:p>
@@ -2089,7 +2145,15 @@
         <w:pStyle w:val="BodyText"/>
       </w:pPr>
       <w:r>
-        <w:t xml:space="preserve">Syntax + Output:</w:t>
+        <w:t xml:space="preserve">Syntax:</w:t>
+      </w:r>
+    </w:p>
+    <w:p>
+      <w:pPr>
+        <w:pStyle w:val="BodyText"/>
+      </w:pPr>
+      <w:r>
+        <w:t xml:space="preserve">Output:</w:t>
       </w:r>
     </w:p>
     <w:p>
@@ -2158,7 +2222,15 @@
         <w:pStyle w:val="BodyText"/>
       </w:pPr>
       <w:r>
-        <w:t xml:space="preserve">Syntax + Output:</w:t>
+        <w:t xml:space="preserve">Syntax:</w:t>
+      </w:r>
+    </w:p>
+    <w:p>
+      <w:pPr>
+        <w:pStyle w:val="BodyText"/>
+      </w:pPr>
+      <w:r>
+        <w:t xml:space="preserve">Output:</w:t>
       </w:r>
     </w:p>
     <w:p>
@@ -3284,7 +3356,15 @@
         <w:pStyle w:val="BodyText"/>
       </w:pPr>
       <w:r>
-        <w:t xml:space="preserve">Syntax + Output:</w:t>
+        <w:t xml:space="preserve">Syntax:</w:t>
+      </w:r>
+    </w:p>
+    <w:p>
+      <w:pPr>
+        <w:pStyle w:val="BodyText"/>
+      </w:pPr>
+      <w:r>
+        <w:t xml:space="preserve">Output:</w:t>
       </w:r>
     </w:p>
     <w:p>
@@ -3863,7 +3943,15 @@
         <w:pStyle w:val="BodyText"/>
       </w:pPr>
       <w:r>
-        <w:t xml:space="preserve">Syntax + Output:</w:t>
+        <w:t xml:space="preserve">Syntax:</w:t>
+      </w:r>
+    </w:p>
+    <w:p>
+      <w:pPr>
+        <w:pStyle w:val="BodyText"/>
+      </w:pPr>
+      <w:r>
+        <w:t xml:space="preserve">Output:</w:t>
       </w:r>
     </w:p>
     <w:p>
@@ -4784,7 +4872,15 @@
         <w:pStyle w:val="BodyText"/>
       </w:pPr>
       <w:r>
-        <w:t xml:space="preserve">Syntax + Output:</w:t>
+        <w:t xml:space="preserve">Syntax:</w:t>
+      </w:r>
+    </w:p>
+    <w:p>
+      <w:pPr>
+        <w:pStyle w:val="BodyText"/>
+      </w:pPr>
+      <w:r>
+        <w:t xml:space="preserve">Output:</w:t>
       </w:r>
     </w:p>
     <w:p>
@@ -5301,7 +5397,15 @@
         <w:pStyle w:val="BodyText"/>
       </w:pPr>
       <w:r>
-        <w:t xml:space="preserve">Syntax + Output:</w:t>
+        <w:t xml:space="preserve">Syntax:</w:t>
+      </w:r>
+    </w:p>
+    <w:p>
+      <w:pPr>
+        <w:pStyle w:val="BodyText"/>
+      </w:pPr>
+      <w:r>
+        <w:t xml:space="preserve">Output:</w:t>
       </w:r>
     </w:p>
     <w:p>
@@ -6118,7 +6222,15 @@
         <w:pStyle w:val="BodyText"/>
       </w:pPr>
       <w:r>
-        <w:t xml:space="preserve">Syntax + Output:</w:t>
+        <w:t xml:space="preserve">Syntax:</w:t>
+      </w:r>
+    </w:p>
+    <w:p>
+      <w:pPr>
+        <w:pStyle w:val="BodyText"/>
+      </w:pPr>
+      <w:r>
+        <w:t xml:space="preserve">Output:</w:t>
       </w:r>
     </w:p>
     <w:p>

</xml_diff>

<commit_message>
Add Syntax/Output labels to every Lab14 final question
</commit_message>
<xml_diff>
--- a/Lab14/lab14_output/lab_14_final.docx
+++ b/Lab14/lab14_output/lab_14_final.docx
@@ -4683,6 +4683,30 @@
         <w:pStyle w:val="BodyText"/>
       </w:pPr>
       <w:r>
+        <w:t xml:space="preserve">Syntax:</w:t>
+      </w:r>
+    </w:p>
+    <w:p>
+      <w:pPr>
+        <w:pStyle w:val="BodyText"/>
+      </w:pPr>
+      <w:r>
+        <w:t xml:space="preserve">N/A (interpretation question)</w:t>
+      </w:r>
+    </w:p>
+    <w:p>
+      <w:pPr>
+        <w:pStyle w:val="BodyText"/>
+      </w:pPr>
+      <w:r>
+        <w:t xml:space="preserve">Output:</w:t>
+      </w:r>
+    </w:p>
+    <w:p>
+      <w:pPr>
+        <w:pStyle w:val="BodyText"/>
+      </w:pPr>
+      <w:r>
         <w:t xml:space="preserve">Model 1 (income): When family income is $0, the predicted spring kindergarten reading score is 48.699 points.</w:t>
       </w:r>
     </w:p>
@@ -4717,6 +4741,30 @@
         <w:pStyle w:val="BodyText"/>
       </w:pPr>
       <w:r>
+        <w:t xml:space="preserve">Syntax:</w:t>
+      </w:r>
+    </w:p>
+    <w:p>
+      <w:pPr>
+        <w:pStyle w:val="BodyText"/>
+      </w:pPr>
+      <w:r>
+        <w:t xml:space="preserve">N/A (interpretation question)</w:t>
+      </w:r>
+    </w:p>
+    <w:p>
+      <w:pPr>
+        <w:pStyle w:val="BodyText"/>
+      </w:pPr>
+      <w:r>
+        <w:t xml:space="preserve">Output:</w:t>
+      </w:r>
+    </w:p>
+    <w:p>
+      <w:pPr>
+        <w:pStyle w:val="BodyText"/>
+      </w:pPr>
+      <w:r>
         <w:t xml:space="preserve">Model 1 (income): For each additional $1,000 of family income, predicted reading score increases by 0.0399 points,</w:t>
       </w:r>
       <w:r>
@@ -4814,6 +4862,30 @@
         <w:pStyle w:val="BodyText"/>
       </w:pPr>
       <w:r>
+        <w:t xml:space="preserve">Syntax:</w:t>
+      </w:r>
+    </w:p>
+    <w:p>
+      <w:pPr>
+        <w:pStyle w:val="BodyText"/>
+      </w:pPr>
+      <w:r>
+        <w:t xml:space="preserve">N/A (interpretation question)</w:t>
+      </w:r>
+    </w:p>
+    <w:p>
+      <w:pPr>
+        <w:pStyle w:val="BodyText"/>
+      </w:pPr>
+      <w:r>
+        <w:t xml:space="preserve">Output:</w:t>
+      </w:r>
+    </w:p>
+    <w:p>
+      <w:pPr>
+        <w:pStyle w:val="BodyText"/>
+      </w:pPr>
+      <w:r>
         <w:t xml:space="preserve">Model 1 (income):</w:t>
       </w:r>
       <w:r>
@@ -6137,6 +6209,30 @@
         <w:pStyle w:val="BodyText"/>
       </w:pPr>
       <w:r>
+        <w:t xml:space="preserve">Syntax:</w:t>
+      </w:r>
+    </w:p>
+    <w:p>
+      <w:pPr>
+        <w:pStyle w:val="BodyText"/>
+      </w:pPr>
+      <w:r>
+        <w:t xml:space="preserve">N/A (interpretation question)</w:t>
+      </w:r>
+    </w:p>
+    <w:p>
+      <w:pPr>
+        <w:pStyle w:val="BodyText"/>
+      </w:pPr>
+      <w:r>
+        <w:t xml:space="preserve">Output:</w:t>
+      </w:r>
+    </w:p>
+    <w:p>
+      <w:pPr>
+        <w:pStyle w:val="BodyText"/>
+      </w:pPr>
+      <w:r>
         <w:t xml:space="preserve">In the z-standardized children model, when the number of household members under 18 is at the sample mean (</w:t>
       </w:r>
       <w:r>
@@ -6172,6 +6268,30 @@
         <w:pStyle w:val="BodyText"/>
       </w:pPr>
       <w:r>
+        <w:t xml:space="preserve">Syntax:</w:t>
+      </w:r>
+    </w:p>
+    <w:p>
+      <w:pPr>
+        <w:pStyle w:val="BodyText"/>
+      </w:pPr>
+      <w:r>
+        <w:t xml:space="preserve">N/A (interpretation question)</w:t>
+      </w:r>
+    </w:p>
+    <w:p>
+      <w:pPr>
+        <w:pStyle w:val="BodyText"/>
+      </w:pPr>
+      <w:r>
+        <w:t xml:space="preserve">Output:</w:t>
+      </w:r>
+    </w:p>
+    <w:p>
+      <w:pPr>
+        <w:pStyle w:val="BodyText"/>
+      </w:pPr>
+      <w:r>
         <w:t xml:space="preserve">In the z-standardized children model, a 1 SD increase in number of household members under 18 predicts a 0.162 SD decrease in reading scores,</w:t>
       </w:r>
       <w:r>
@@ -6618,6 +6738,30 @@
         <w:pStyle w:val="BodyText"/>
       </w:pPr>
       <w:r>
+        <w:t xml:space="preserve">Syntax:</w:t>
+      </w:r>
+    </w:p>
+    <w:p>
+      <w:pPr>
+        <w:pStyle w:val="BodyText"/>
+      </w:pPr>
+      <w:r>
+        <w:t xml:space="preserve">N/A (write-up question)</w:t>
+      </w:r>
+    </w:p>
+    <w:p>
+      <w:pPr>
+        <w:pStyle w:val="BodyText"/>
+      </w:pPr>
+      <w:r>
+        <w:t xml:space="preserve">Output:</w:t>
+      </w:r>
+    </w:p>
+    <w:p>
+      <w:pPr>
+        <w:pStyle w:val="BodyText"/>
+      </w:pPr>
+      <w:r>
         <w:t xml:space="preserve">In separate bivariate regressions, spring kindergarten reading scores were positively associated with family income (in $1,000s),</w:t>
       </w:r>
       <w:r>
@@ -6778,6 +6922,30 @@
     <w:p>
       <w:pPr>
         <w:pStyle w:val="FirstParagraph"/>
+      </w:pPr>
+      <w:r>
+        <w:t xml:space="preserve">Syntax:</w:t>
+      </w:r>
+    </w:p>
+    <w:p>
+      <w:pPr>
+        <w:pStyle w:val="BodyText"/>
+      </w:pPr>
+      <w:r>
+        <w:t xml:space="preserve">N/A</w:t>
+      </w:r>
+    </w:p>
+    <w:p>
+      <w:pPr>
+        <w:pStyle w:val="BodyText"/>
+      </w:pPr>
+      <w:r>
+        <w:t xml:space="preserve">Output:</w:t>
+      </w:r>
+    </w:p>
+    <w:p>
+      <w:pPr>
+        <w:pStyle w:val="BodyText"/>
       </w:pPr>
       <w:r>
         <w:t xml:space="preserve">Upload your lab to Canvas. Double check to make sure the upload took.</w:t>

</xml_diff>

<commit_message>
Remove Syntax/Output headings from Lab14 final Rmd and docx
</commit_message>
<xml_diff>
--- a/Lab14/lab14_output/lab_14_final.docx
+++ b/Lab14/lab14_output/lab_14_final.docx
@@ -189,22 +189,6 @@
     </w:p>
     <w:p>
       <w:pPr>
-        <w:pStyle w:val="BodyText"/>
-      </w:pPr>
-      <w:r>
-        <w:t xml:space="preserve">Syntax:</w:t>
-      </w:r>
-    </w:p>
-    <w:p>
-      <w:pPr>
-        <w:pStyle w:val="BodyText"/>
-      </w:pPr>
-      <w:r>
-        <w:t xml:space="preserve">Output:</w:t>
-      </w:r>
-    </w:p>
-    <w:p>
-      <w:pPr>
         <w:pStyle w:val="SourceCode"/>
       </w:pPr>
       <w:r>
@@ -513,22 +497,6 @@
     </w:p>
     <w:p>
       <w:pPr>
-        <w:pStyle w:val="BodyText"/>
-      </w:pPr>
-      <w:r>
-        <w:t xml:space="preserve">Syntax:</w:t>
-      </w:r>
-    </w:p>
-    <w:p>
-      <w:pPr>
-        <w:pStyle w:val="BodyText"/>
-      </w:pPr>
-      <w:r>
-        <w:t xml:space="preserve">Output:</w:t>
-      </w:r>
-    </w:p>
-    <w:p>
-      <w:pPr>
         <w:pStyle w:val="SourceCode"/>
       </w:pPr>
       <w:r>
@@ -710,22 +678,6 @@
     </w:p>
     <w:p>
       <w:pPr>
-        <w:pStyle w:val="BodyText"/>
-      </w:pPr>
-      <w:r>
-        <w:t xml:space="preserve">Syntax:</w:t>
-      </w:r>
-    </w:p>
-    <w:p>
-      <w:pPr>
-        <w:pStyle w:val="BodyText"/>
-      </w:pPr>
-      <w:r>
-        <w:t xml:space="preserve">Output:</w:t>
-      </w:r>
-    </w:p>
-    <w:p>
-      <w:pPr>
         <w:pStyle w:val="SourceCode"/>
       </w:pPr>
       <w:r>
@@ -1072,22 +1024,6 @@
     </w:p>
     <w:p>
       <w:pPr>
-        <w:pStyle w:val="BodyText"/>
-      </w:pPr>
-      <w:r>
-        <w:t xml:space="preserve">Syntax:</w:t>
-      </w:r>
-    </w:p>
-    <w:p>
-      <w:pPr>
-        <w:pStyle w:val="BodyText"/>
-      </w:pPr>
-      <w:r>
-        <w:t xml:space="preserve">Output:</w:t>
-      </w:r>
-    </w:p>
-    <w:p>
-      <w:pPr>
         <w:pStyle w:val="SourceCode"/>
       </w:pPr>
       <w:r>
@@ -1476,22 +1412,6 @@
     </w:p>
     <w:p>
       <w:pPr>
-        <w:pStyle w:val="BodyText"/>
-      </w:pPr>
-      <w:r>
-        <w:t xml:space="preserve">Syntax:</w:t>
-      </w:r>
-    </w:p>
-    <w:p>
-      <w:pPr>
-        <w:pStyle w:val="BodyText"/>
-      </w:pPr>
-      <w:r>
-        <w:t xml:space="preserve">Output:</w:t>
-      </w:r>
-    </w:p>
-    <w:p>
-      <w:pPr>
         <w:pStyle w:val="SourceCode"/>
       </w:pPr>
       <w:r>
@@ -1575,22 +1495,6 @@
     </w:p>
     <w:p>
       <w:pPr>
-        <w:pStyle w:val="BodyText"/>
-      </w:pPr>
-      <w:r>
-        <w:t xml:space="preserve">Syntax:</w:t>
-      </w:r>
-    </w:p>
-    <w:p>
-      <w:pPr>
-        <w:pStyle w:val="BodyText"/>
-      </w:pPr>
-      <w:r>
-        <w:t xml:space="preserve">Output:</w:t>
-      </w:r>
-    </w:p>
-    <w:p>
-      <w:pPr>
         <w:pStyle w:val="SourceCode"/>
       </w:pPr>
       <w:r>
@@ -1985,22 +1889,6 @@
     </w:p>
     <w:p>
       <w:pPr>
-        <w:pStyle w:val="BodyText"/>
-      </w:pPr>
-      <w:r>
-        <w:t xml:space="preserve">Syntax:</w:t>
-      </w:r>
-    </w:p>
-    <w:p>
-      <w:pPr>
-        <w:pStyle w:val="BodyText"/>
-      </w:pPr>
-      <w:r>
-        <w:t xml:space="preserve">Output:</w:t>
-      </w:r>
-    </w:p>
-    <w:p>
-      <w:pPr>
         <w:pStyle w:val="SourceCode"/>
       </w:pPr>
       <w:r>
@@ -2142,22 +2030,6 @@
     </w:p>
     <w:p>
       <w:pPr>
-        <w:pStyle w:val="BodyText"/>
-      </w:pPr>
-      <w:r>
-        <w:t xml:space="preserve">Syntax:</w:t>
-      </w:r>
-    </w:p>
-    <w:p>
-      <w:pPr>
-        <w:pStyle w:val="BodyText"/>
-      </w:pPr>
-      <w:r>
-        <w:t xml:space="preserve">Output:</w:t>
-      </w:r>
-    </w:p>
-    <w:p>
-      <w:pPr>
         <w:pStyle w:val="SourceCode"/>
       </w:pPr>
       <w:r>
@@ -2215,22 +2087,6 @@
       </w:pPr>
       <w:r>
         <w:t xml:space="preserve">Construct a histogram of the distribution of the test score, income, and # of children variables (use the original variables). The histograms should show percentages and have clear axis labels.</w:t>
-      </w:r>
-    </w:p>
-    <w:p>
-      <w:pPr>
-        <w:pStyle w:val="BodyText"/>
-      </w:pPr>
-      <w:r>
-        <w:t xml:space="preserve">Syntax:</w:t>
-      </w:r>
-    </w:p>
-    <w:p>
-      <w:pPr>
-        <w:pStyle w:val="BodyText"/>
-      </w:pPr>
-      <w:r>
-        <w:t xml:space="preserve">Output:</w:t>
       </w:r>
     </w:p>
     <w:p>
@@ -3353,22 +3209,6 @@
     </w:p>
     <w:p>
       <w:pPr>
-        <w:pStyle w:val="BodyText"/>
-      </w:pPr>
-      <w:r>
-        <w:t xml:space="preserve">Syntax:</w:t>
-      </w:r>
-    </w:p>
-    <w:p>
-      <w:pPr>
-        <w:pStyle w:val="BodyText"/>
-      </w:pPr>
-      <w:r>
-        <w:t xml:space="preserve">Output:</w:t>
-      </w:r>
-    </w:p>
-    <w:p>
-      <w:pPr>
         <w:pStyle w:val="SourceCode"/>
       </w:pPr>
       <w:r>
@@ -3940,22 +3780,6 @@
     </w:p>
     <w:p>
       <w:pPr>
-        <w:pStyle w:val="BodyText"/>
-      </w:pPr>
-      <w:r>
-        <w:t xml:space="preserve">Syntax:</w:t>
-      </w:r>
-    </w:p>
-    <w:p>
-      <w:pPr>
-        <w:pStyle w:val="BodyText"/>
-      </w:pPr>
-      <w:r>
-        <w:t xml:space="preserve">Output:</w:t>
-      </w:r>
-    </w:p>
-    <w:p>
-      <w:pPr>
         <w:pStyle w:val="SourceCode"/>
       </w:pPr>
       <w:r>
@@ -4683,30 +4507,6 @@
         <w:pStyle w:val="BodyText"/>
       </w:pPr>
       <w:r>
-        <w:t xml:space="preserve">Syntax:</w:t>
-      </w:r>
-    </w:p>
-    <w:p>
-      <w:pPr>
-        <w:pStyle w:val="BodyText"/>
-      </w:pPr>
-      <w:r>
-        <w:t xml:space="preserve">N/A (interpretation question)</w:t>
-      </w:r>
-    </w:p>
-    <w:p>
-      <w:pPr>
-        <w:pStyle w:val="BodyText"/>
-      </w:pPr>
-      <w:r>
-        <w:t xml:space="preserve">Output:</w:t>
-      </w:r>
-    </w:p>
-    <w:p>
-      <w:pPr>
-        <w:pStyle w:val="BodyText"/>
-      </w:pPr>
-      <w:r>
         <w:t xml:space="preserve">Model 1 (income): When family income is $0, the predicted spring kindergarten reading score is 48.699 points.</w:t>
       </w:r>
     </w:p>
@@ -4741,30 +4541,6 @@
         <w:pStyle w:val="BodyText"/>
       </w:pPr>
       <w:r>
-        <w:t xml:space="preserve">Syntax:</w:t>
-      </w:r>
-    </w:p>
-    <w:p>
-      <w:pPr>
-        <w:pStyle w:val="BodyText"/>
-      </w:pPr>
-      <w:r>
-        <w:t xml:space="preserve">N/A (interpretation question)</w:t>
-      </w:r>
-    </w:p>
-    <w:p>
-      <w:pPr>
-        <w:pStyle w:val="BodyText"/>
-      </w:pPr>
-      <w:r>
-        <w:t xml:space="preserve">Output:</w:t>
-      </w:r>
-    </w:p>
-    <w:p>
-      <w:pPr>
-        <w:pStyle w:val="BodyText"/>
-      </w:pPr>
-      <w:r>
         <w:t xml:space="preserve">Model 1 (income): For each additional $1,000 of family income, predicted reading score increases by 0.0399 points,</w:t>
       </w:r>
       <w:r>
@@ -4862,30 +4638,6 @@
         <w:pStyle w:val="BodyText"/>
       </w:pPr>
       <w:r>
-        <w:t xml:space="preserve">Syntax:</w:t>
-      </w:r>
-    </w:p>
-    <w:p>
-      <w:pPr>
-        <w:pStyle w:val="BodyText"/>
-      </w:pPr>
-      <w:r>
-        <w:t xml:space="preserve">N/A (interpretation question)</w:t>
-      </w:r>
-    </w:p>
-    <w:p>
-      <w:pPr>
-        <w:pStyle w:val="BodyText"/>
-      </w:pPr>
-      <w:r>
-        <w:t xml:space="preserve">Output:</w:t>
-      </w:r>
-    </w:p>
-    <w:p>
-      <w:pPr>
-        <w:pStyle w:val="BodyText"/>
-      </w:pPr>
-      <w:r>
         <w:t xml:space="preserve">Model 1 (income):</w:t>
       </w:r>
       <w:r>
@@ -4941,22 +4693,6 @@
     </w:p>
     <w:p>
       <w:pPr>
-        <w:pStyle w:val="BodyText"/>
-      </w:pPr>
-      <w:r>
-        <w:t xml:space="preserve">Syntax:</w:t>
-      </w:r>
-    </w:p>
-    <w:p>
-      <w:pPr>
-        <w:pStyle w:val="BodyText"/>
-      </w:pPr>
-      <w:r>
-        <w:t xml:space="preserve">Output:</w:t>
-      </w:r>
-    </w:p>
-    <w:p>
-      <w:pPr>
         <w:pStyle w:val="SourceCode"/>
       </w:pPr>
       <w:r>
@@ -5466,22 +5202,6 @@
     </w:p>
     <w:p>
       <w:pPr>
-        <w:pStyle w:val="BodyText"/>
-      </w:pPr>
-      <w:r>
-        <w:t xml:space="preserve">Syntax:</w:t>
-      </w:r>
-    </w:p>
-    <w:p>
-      <w:pPr>
-        <w:pStyle w:val="BodyText"/>
-      </w:pPr>
-      <w:r>
-        <w:t xml:space="preserve">Output:</w:t>
-      </w:r>
-    </w:p>
-    <w:p>
-      <w:pPr>
         <w:pStyle w:val="SourceCode"/>
       </w:pPr>
       <w:r>
@@ -6209,30 +5929,6 @@
         <w:pStyle w:val="BodyText"/>
       </w:pPr>
       <w:r>
-        <w:t xml:space="preserve">Syntax:</w:t>
-      </w:r>
-    </w:p>
-    <w:p>
-      <w:pPr>
-        <w:pStyle w:val="BodyText"/>
-      </w:pPr>
-      <w:r>
-        <w:t xml:space="preserve">N/A (interpretation question)</w:t>
-      </w:r>
-    </w:p>
-    <w:p>
-      <w:pPr>
-        <w:pStyle w:val="BodyText"/>
-      </w:pPr>
-      <w:r>
-        <w:t xml:space="preserve">Output:</w:t>
-      </w:r>
-    </w:p>
-    <w:p>
-      <w:pPr>
-        <w:pStyle w:val="BodyText"/>
-      </w:pPr>
-      <w:r>
         <w:t xml:space="preserve">In the z-standardized children model, when the number of household members under 18 is at the sample mean (</w:t>
       </w:r>
       <w:r>
@@ -6268,30 +5964,6 @@
         <w:pStyle w:val="BodyText"/>
       </w:pPr>
       <w:r>
-        <w:t xml:space="preserve">Syntax:</w:t>
-      </w:r>
-    </w:p>
-    <w:p>
-      <w:pPr>
-        <w:pStyle w:val="BodyText"/>
-      </w:pPr>
-      <w:r>
-        <w:t xml:space="preserve">N/A (interpretation question)</w:t>
-      </w:r>
-    </w:p>
-    <w:p>
-      <w:pPr>
-        <w:pStyle w:val="BodyText"/>
-      </w:pPr>
-      <w:r>
-        <w:t xml:space="preserve">Output:</w:t>
-      </w:r>
-    </w:p>
-    <w:p>
-      <w:pPr>
-        <w:pStyle w:val="BodyText"/>
-      </w:pPr>
-      <w:r>
         <w:t xml:space="preserve">In the z-standardized children model, a 1 SD increase in number of household members under 18 predicts a 0.162 SD decrease in reading scores,</w:t>
       </w:r>
       <w:r>
@@ -6339,22 +6011,6 @@
     </w:p>
     <w:p>
       <w:pPr>
-        <w:pStyle w:val="BodyText"/>
-      </w:pPr>
-      <w:r>
-        <w:t xml:space="preserve">Syntax:</w:t>
-      </w:r>
-    </w:p>
-    <w:p>
-      <w:pPr>
-        <w:pStyle w:val="BodyText"/>
-      </w:pPr>
-      <w:r>
-        <w:t xml:space="preserve">Output:</w:t>
-      </w:r>
-    </w:p>
-    <w:p>
-      <w:pPr>
         <w:pStyle w:val="SourceCode"/>
       </w:pPr>
       <w:r>
@@ -6738,30 +6394,6 @@
         <w:pStyle w:val="BodyText"/>
       </w:pPr>
       <w:r>
-        <w:t xml:space="preserve">Syntax:</w:t>
-      </w:r>
-    </w:p>
-    <w:p>
-      <w:pPr>
-        <w:pStyle w:val="BodyText"/>
-      </w:pPr>
-      <w:r>
-        <w:t xml:space="preserve">N/A (write-up question)</w:t>
-      </w:r>
-    </w:p>
-    <w:p>
-      <w:pPr>
-        <w:pStyle w:val="BodyText"/>
-      </w:pPr>
-      <w:r>
-        <w:t xml:space="preserve">Output:</w:t>
-      </w:r>
-    </w:p>
-    <w:p>
-      <w:pPr>
-        <w:pStyle w:val="BodyText"/>
-      </w:pPr>
-      <w:r>
         <w:t xml:space="preserve">In separate bivariate regressions, spring kindergarten reading scores were positively associated with family income (in $1,000s),</w:t>
       </w:r>
       <w:r>
@@ -6922,30 +6554,6 @@
     <w:p>
       <w:pPr>
         <w:pStyle w:val="FirstParagraph"/>
-      </w:pPr>
-      <w:r>
-        <w:t xml:space="preserve">Syntax:</w:t>
-      </w:r>
-    </w:p>
-    <w:p>
-      <w:pPr>
-        <w:pStyle w:val="BodyText"/>
-      </w:pPr>
-      <w:r>
-        <w:t xml:space="preserve">N/A</w:t>
-      </w:r>
-    </w:p>
-    <w:p>
-      <w:pPr>
-        <w:pStyle w:val="BodyText"/>
-      </w:pPr>
-      <w:r>
-        <w:t xml:space="preserve">Output:</w:t>
-      </w:r>
-    </w:p>
-    <w:p>
-      <w:pPr>
-        <w:pStyle w:val="BodyText"/>
       </w:pPr>
       <w:r>
         <w:t xml:space="preserve">Upload your lab to Canvas. Double check to make sure the upload took.</w:t>

</xml_diff>

<commit_message>
Set Lab14 final docx to include Syntax/Output per question
</commit_message>
<xml_diff>
--- a/Lab14/lab14_output/lab_14_final.docx
+++ b/Lab14/lab14_output/lab_14_final.docx
@@ -189,6 +189,22 @@
     </w:p>
     <w:p>
       <w:pPr>
+        <w:pStyle w:val="BodyText"/>
+      </w:pPr>
+      <w:r>
+        <w:t xml:space="preserve">Syntax:</w:t>
+      </w:r>
+    </w:p>
+    <w:p>
+      <w:pPr>
+        <w:pStyle w:val="BodyText"/>
+      </w:pPr>
+      <w:r>
+        <w:t xml:space="preserve">Output:</w:t>
+      </w:r>
+    </w:p>
+    <w:p>
+      <w:pPr>
         <w:pStyle w:val="SourceCode"/>
       </w:pPr>
       <w:r>
@@ -497,6 +513,22 @@
     </w:p>
     <w:p>
       <w:pPr>
+        <w:pStyle w:val="BodyText"/>
+      </w:pPr>
+      <w:r>
+        <w:t xml:space="preserve">Syntax:</w:t>
+      </w:r>
+    </w:p>
+    <w:p>
+      <w:pPr>
+        <w:pStyle w:val="BodyText"/>
+      </w:pPr>
+      <w:r>
+        <w:t xml:space="preserve">Output:</w:t>
+      </w:r>
+    </w:p>
+    <w:p>
+      <w:pPr>
         <w:pStyle w:val="SourceCode"/>
       </w:pPr>
       <w:r>
@@ -678,6 +710,22 @@
     </w:p>
     <w:p>
       <w:pPr>
+        <w:pStyle w:val="BodyText"/>
+      </w:pPr>
+      <w:r>
+        <w:t xml:space="preserve">Syntax:</w:t>
+      </w:r>
+    </w:p>
+    <w:p>
+      <w:pPr>
+        <w:pStyle w:val="BodyText"/>
+      </w:pPr>
+      <w:r>
+        <w:t xml:space="preserve">Output:</w:t>
+      </w:r>
+    </w:p>
+    <w:p>
+      <w:pPr>
         <w:pStyle w:val="SourceCode"/>
       </w:pPr>
       <w:r>
@@ -1024,6 +1072,22 @@
     </w:p>
     <w:p>
       <w:pPr>
+        <w:pStyle w:val="BodyText"/>
+      </w:pPr>
+      <w:r>
+        <w:t xml:space="preserve">Syntax:</w:t>
+      </w:r>
+    </w:p>
+    <w:p>
+      <w:pPr>
+        <w:pStyle w:val="BodyText"/>
+      </w:pPr>
+      <w:r>
+        <w:t xml:space="preserve">Output:</w:t>
+      </w:r>
+    </w:p>
+    <w:p>
+      <w:pPr>
         <w:pStyle w:val="SourceCode"/>
       </w:pPr>
       <w:r>
@@ -1412,6 +1476,22 @@
     </w:p>
     <w:p>
       <w:pPr>
+        <w:pStyle w:val="BodyText"/>
+      </w:pPr>
+      <w:r>
+        <w:t xml:space="preserve">Syntax:</w:t>
+      </w:r>
+    </w:p>
+    <w:p>
+      <w:pPr>
+        <w:pStyle w:val="BodyText"/>
+      </w:pPr>
+      <w:r>
+        <w:t xml:space="preserve">Output:</w:t>
+      </w:r>
+    </w:p>
+    <w:p>
+      <w:pPr>
         <w:pStyle w:val="SourceCode"/>
       </w:pPr>
       <w:r>
@@ -1495,6 +1575,22 @@
     </w:p>
     <w:p>
       <w:pPr>
+        <w:pStyle w:val="BodyText"/>
+      </w:pPr>
+      <w:r>
+        <w:t xml:space="preserve">Syntax:</w:t>
+      </w:r>
+    </w:p>
+    <w:p>
+      <w:pPr>
+        <w:pStyle w:val="BodyText"/>
+      </w:pPr>
+      <w:r>
+        <w:t xml:space="preserve">Output:</w:t>
+      </w:r>
+    </w:p>
+    <w:p>
+      <w:pPr>
         <w:pStyle w:val="SourceCode"/>
       </w:pPr>
       <w:r>
@@ -1889,6 +1985,22 @@
     </w:p>
     <w:p>
       <w:pPr>
+        <w:pStyle w:val="BodyText"/>
+      </w:pPr>
+      <w:r>
+        <w:t xml:space="preserve">Syntax:</w:t>
+      </w:r>
+    </w:p>
+    <w:p>
+      <w:pPr>
+        <w:pStyle w:val="BodyText"/>
+      </w:pPr>
+      <w:r>
+        <w:t xml:space="preserve">Output:</w:t>
+      </w:r>
+    </w:p>
+    <w:p>
+      <w:pPr>
         <w:pStyle w:val="SourceCode"/>
       </w:pPr>
       <w:r>
@@ -2030,6 +2142,22 @@
     </w:p>
     <w:p>
       <w:pPr>
+        <w:pStyle w:val="BodyText"/>
+      </w:pPr>
+      <w:r>
+        <w:t xml:space="preserve">Syntax:</w:t>
+      </w:r>
+    </w:p>
+    <w:p>
+      <w:pPr>
+        <w:pStyle w:val="BodyText"/>
+      </w:pPr>
+      <w:r>
+        <w:t xml:space="preserve">Output:</w:t>
+      </w:r>
+    </w:p>
+    <w:p>
+      <w:pPr>
         <w:pStyle w:val="SourceCode"/>
       </w:pPr>
       <w:r>
@@ -2087,6 +2215,22 @@
       </w:pPr>
       <w:r>
         <w:t xml:space="preserve">Construct a histogram of the distribution of the test score, income, and # of children variables (use the original variables). The histograms should show percentages and have clear axis labels.</w:t>
+      </w:r>
+    </w:p>
+    <w:p>
+      <w:pPr>
+        <w:pStyle w:val="BodyText"/>
+      </w:pPr>
+      <w:r>
+        <w:t xml:space="preserve">Syntax:</w:t>
+      </w:r>
+    </w:p>
+    <w:p>
+      <w:pPr>
+        <w:pStyle w:val="BodyText"/>
+      </w:pPr>
+      <w:r>
+        <w:t xml:space="preserve">Output:</w:t>
       </w:r>
     </w:p>
     <w:p>
@@ -2454,7 +2598,7 @@
               <a:graphicData uri="http://schemas.openxmlformats.org/drawingml/2006/picture">
                 <pic:pic>
                   <pic:nvPicPr>
-                    <pic:cNvPr descr="lab_14_final_files/figure-docx/unnamed-chunk-9-1.png" id="30" name="Picture"/>
+                    <pic:cNvPr descr="/tmp/lab14_test_files/figure-docx/unnamed-chunk-9-1.png" id="30" name="Picture"/>
                     <pic:cNvPicPr>
                       <a:picLocks noChangeArrowheads="1" noChangeAspect="1"/>
                     </pic:cNvPicPr>
@@ -2805,7 +2949,7 @@
               <a:graphicData uri="http://schemas.openxmlformats.org/drawingml/2006/picture">
                 <pic:pic>
                   <pic:nvPicPr>
-                    <pic:cNvPr descr="lab_14_final_files/figure-docx/unnamed-chunk-10-1.png" id="33" name="Picture"/>
+                    <pic:cNvPr descr="/tmp/lab14_test_files/figure-docx/unnamed-chunk-10-1.png" id="33" name="Picture"/>
                     <pic:cNvPicPr>
                       <a:picLocks noChangeArrowheads="1" noChangeAspect="1"/>
                     </pic:cNvPicPr>
@@ -3156,7 +3300,7 @@
               <a:graphicData uri="http://schemas.openxmlformats.org/drawingml/2006/picture">
                 <pic:pic>
                   <pic:nvPicPr>
-                    <pic:cNvPr descr="lab_14_final_files/figure-docx/unnamed-chunk-11-1.png" id="36" name="Picture"/>
+                    <pic:cNvPr descr="/tmp/lab14_test_files/figure-docx/unnamed-chunk-11-1.png" id="36" name="Picture"/>
                     <pic:cNvPicPr>
                       <a:picLocks noChangeArrowheads="1" noChangeAspect="1"/>
                     </pic:cNvPicPr>
@@ -3209,6 +3353,22 @@
     </w:p>
     <w:p>
       <w:pPr>
+        <w:pStyle w:val="BodyText"/>
+      </w:pPr>
+      <w:r>
+        <w:t xml:space="preserve">Syntax:</w:t>
+      </w:r>
+    </w:p>
+    <w:p>
+      <w:pPr>
+        <w:pStyle w:val="BodyText"/>
+      </w:pPr>
+      <w:r>
+        <w:t xml:space="preserve">Output:</w:t>
+      </w:r>
+    </w:p>
+    <w:p>
+      <w:pPr>
         <w:pStyle w:val="SourceCode"/>
       </w:pPr>
       <w:r>
@@ -3780,6 +3940,22 @@
     </w:p>
     <w:p>
       <w:pPr>
+        <w:pStyle w:val="BodyText"/>
+      </w:pPr>
+      <w:r>
+        <w:t xml:space="preserve">Syntax:</w:t>
+      </w:r>
+    </w:p>
+    <w:p>
+      <w:pPr>
+        <w:pStyle w:val="BodyText"/>
+      </w:pPr>
+      <w:r>
+        <w:t xml:space="preserve">Output:</w:t>
+      </w:r>
+    </w:p>
+    <w:p>
+      <w:pPr>
         <w:pStyle w:val="SourceCode"/>
       </w:pPr>
       <w:r>
@@ -4499,6 +4675,30 @@
         <w:pStyle w:val="FirstParagraph"/>
       </w:pPr>
       <w:r>
+        <w:t xml:space="preserve">Syntax:</w:t>
+      </w:r>
+    </w:p>
+    <w:p>
+      <w:pPr>
+        <w:pStyle w:val="BodyText"/>
+      </w:pPr>
+      <w:r>
+        <w:t xml:space="preserve">N/A</w:t>
+      </w:r>
+    </w:p>
+    <w:p>
+      <w:pPr>
+        <w:pStyle w:val="BodyText"/>
+      </w:pPr>
+      <w:r>
+        <w:t xml:space="preserve">Output:</w:t>
+      </w:r>
+    </w:p>
+    <w:p>
+      <w:pPr>
+        <w:pStyle w:val="BodyText"/>
+      </w:pPr>
+      <w:r>
         <w:t xml:space="preserve">Give a textbook interpretation of the intercept in both models. Your interpretation should make clear the units of measurement.</w:t>
       </w:r>
     </w:p>
@@ -4533,6 +4733,30 @@
         <w:pStyle w:val="FirstParagraph"/>
       </w:pPr>
       <w:r>
+        <w:t xml:space="preserve">Syntax:</w:t>
+      </w:r>
+    </w:p>
+    <w:p>
+      <w:pPr>
+        <w:pStyle w:val="BodyText"/>
+      </w:pPr>
+      <w:r>
+        <w:t xml:space="preserve">N/A</w:t>
+      </w:r>
+    </w:p>
+    <w:p>
+      <w:pPr>
+        <w:pStyle w:val="BodyText"/>
+      </w:pPr>
+      <w:r>
+        <w:t xml:space="preserve">Output:</w:t>
+      </w:r>
+    </w:p>
+    <w:p>
+      <w:pPr>
+        <w:pStyle w:val="BodyText"/>
+      </w:pPr>
+      <w:r>
         <w:t xml:space="preserve">Give a textbook interpretation of the slope in both models. Your interpretation should make clear the units of measurement.</w:t>
       </w:r>
     </w:p>
@@ -4615,6 +4839,30 @@
         <w:pStyle w:val="FirstParagraph"/>
       </w:pPr>
       <w:r>
+        <w:t xml:space="preserve">Syntax:</w:t>
+      </w:r>
+    </w:p>
+    <w:p>
+      <w:pPr>
+        <w:pStyle w:val="BodyText"/>
+      </w:pPr>
+      <w:r>
+        <w:t xml:space="preserve">N/A</w:t>
+      </w:r>
+    </w:p>
+    <w:p>
+      <w:pPr>
+        <w:pStyle w:val="BodyText"/>
+      </w:pPr>
+      <w:r>
+        <w:t xml:space="preserve">Output:</w:t>
+      </w:r>
+    </w:p>
+    <w:p>
+      <w:pPr>
+        <w:pStyle w:val="BodyText"/>
+      </w:pPr>
+      <w:r>
         <w:t xml:space="preserve">Give a textbook interpretation of the</w:t>
       </w:r>
       <w:r>
@@ -4693,6 +4941,22 @@
     </w:p>
     <w:p>
       <w:pPr>
+        <w:pStyle w:val="BodyText"/>
+      </w:pPr>
+      <w:r>
+        <w:t xml:space="preserve">Syntax:</w:t>
+      </w:r>
+    </w:p>
+    <w:p>
+      <w:pPr>
+        <w:pStyle w:val="BodyText"/>
+      </w:pPr>
+      <w:r>
+        <w:t xml:space="preserve">Output:</w:t>
+      </w:r>
+    </w:p>
+    <w:p>
+      <w:pPr>
         <w:pStyle w:val="SourceCode"/>
       </w:pPr>
       <w:r>
@@ -5202,6 +5466,22 @@
     </w:p>
     <w:p>
       <w:pPr>
+        <w:pStyle w:val="BodyText"/>
+      </w:pPr>
+      <w:r>
+        <w:t xml:space="preserve">Syntax:</w:t>
+      </w:r>
+    </w:p>
+    <w:p>
+      <w:pPr>
+        <w:pStyle w:val="BodyText"/>
+      </w:pPr>
+      <w:r>
+        <w:t xml:space="preserve">Output:</w:t>
+      </w:r>
+    </w:p>
+    <w:p>
+      <w:pPr>
         <w:pStyle w:val="SourceCode"/>
       </w:pPr>
       <w:r>
@@ -5921,6 +6201,30 @@
         <w:pStyle w:val="FirstParagraph"/>
       </w:pPr>
       <w:r>
+        <w:t xml:space="preserve">Syntax:</w:t>
+      </w:r>
+    </w:p>
+    <w:p>
+      <w:pPr>
+        <w:pStyle w:val="BodyText"/>
+      </w:pPr>
+      <w:r>
+        <w:t xml:space="preserve">N/A</w:t>
+      </w:r>
+    </w:p>
+    <w:p>
+      <w:pPr>
+        <w:pStyle w:val="BodyText"/>
+      </w:pPr>
+      <w:r>
+        <w:t xml:space="preserve">Output:</w:t>
+      </w:r>
+    </w:p>
+    <w:p>
+      <w:pPr>
+        <w:pStyle w:val="BodyText"/>
+      </w:pPr>
+      <w:r>
         <w:t xml:space="preserve">Give a textbook interpretation for the intercept for the model where # of children in the household is the predictor.</w:t>
       </w:r>
     </w:p>
@@ -5956,6 +6260,30 @@
         <w:pStyle w:val="FirstParagraph"/>
       </w:pPr>
       <w:r>
+        <w:t xml:space="preserve">Syntax:</w:t>
+      </w:r>
+    </w:p>
+    <w:p>
+      <w:pPr>
+        <w:pStyle w:val="BodyText"/>
+      </w:pPr>
+      <w:r>
+        <w:t xml:space="preserve">N/A</w:t>
+      </w:r>
+    </w:p>
+    <w:p>
+      <w:pPr>
+        <w:pStyle w:val="BodyText"/>
+      </w:pPr>
+      <w:r>
+        <w:t xml:space="preserve">Output:</w:t>
+      </w:r>
+    </w:p>
+    <w:p>
+      <w:pPr>
+        <w:pStyle w:val="BodyText"/>
+      </w:pPr>
+      <w:r>
         <w:t xml:space="preserve">Give a textbook interpretation for the slope for the model where # of children in the household is the predictor.</w:t>
       </w:r>
     </w:p>
@@ -6011,6 +6339,22 @@
     </w:p>
     <w:p>
       <w:pPr>
+        <w:pStyle w:val="BodyText"/>
+      </w:pPr>
+      <w:r>
+        <w:t xml:space="preserve">Syntax:</w:t>
+      </w:r>
+    </w:p>
+    <w:p>
+      <w:pPr>
+        <w:pStyle w:val="BodyText"/>
+      </w:pPr>
+      <w:r>
+        <w:t xml:space="preserve">Output:</w:t>
+      </w:r>
+    </w:p>
+    <w:p>
+      <w:pPr>
         <w:pStyle w:val="SourceCode"/>
       </w:pPr>
       <w:r>
@@ -6386,6 +6730,30 @@
         <w:pStyle w:val="FirstParagraph"/>
       </w:pPr>
       <w:r>
+        <w:t xml:space="preserve">Syntax:</w:t>
+      </w:r>
+    </w:p>
+    <w:p>
+      <w:pPr>
+        <w:pStyle w:val="BodyText"/>
+      </w:pPr>
+      <w:r>
+        <w:t xml:space="preserve">N/A</w:t>
+      </w:r>
+    </w:p>
+    <w:p>
+      <w:pPr>
+        <w:pStyle w:val="BodyText"/>
+      </w:pPr>
+      <w:r>
+        <w:t xml:space="preserve">Output:</w:t>
+      </w:r>
+    </w:p>
+    <w:p>
+      <w:pPr>
+        <w:pStyle w:val="BodyText"/>
+      </w:pPr>
+      <w:r>
         <w:t xml:space="preserve">In ONE sentence, write up the results of both regressions in APA style.</w:t>
       </w:r>
     </w:p>
@@ -6554,6 +6922,30 @@
     <w:p>
       <w:pPr>
         <w:pStyle w:val="FirstParagraph"/>
+      </w:pPr>
+      <w:r>
+        <w:t xml:space="preserve">Syntax:</w:t>
+      </w:r>
+    </w:p>
+    <w:p>
+      <w:pPr>
+        <w:pStyle w:val="BodyText"/>
+      </w:pPr>
+      <w:r>
+        <w:t xml:space="preserve">N/A</w:t>
+      </w:r>
+    </w:p>
+    <w:p>
+      <w:pPr>
+        <w:pStyle w:val="BodyText"/>
+      </w:pPr>
+      <w:r>
+        <w:t xml:space="preserve">Output:</w:t>
+      </w:r>
+    </w:p>
+    <w:p>
+      <w:pPr>
+        <w:pStyle w:val="BodyText"/>
       </w:pPr>
       <w:r>
         <w:t xml:space="preserve">Upload your lab to Canvas. Double check to make sure the upload took.</w:t>

</xml_diff>

<commit_message>
Align Lab 14 final Rmd/docx format with Lab 12/13 workflow
</commit_message>
<xml_diff>
--- a/Lab14/lab14_output/lab_14_final.docx
+++ b/Lab14/lab14_output/lab_14_final.docx
@@ -53,6 +53,192 @@
         <w:t xml:space="preserve">dataset and conduct two simple linear regressions where spring kindergarten reading scores are the outcome. One predictor is the family’s income, and the other predictor is the number of children less than 18 years old who live in the household.</w:t>
       </w:r>
     </w:p>
+    <w:p>
+      <w:pPr>
+        <w:pStyle w:val="BodyText"/>
+      </w:pPr>
+      <w:r>
+        <w:t xml:space="preserve">As you progress through the assignment, you may need to customize</w:t>
+      </w:r>
+      <w:r>
+        <w:t xml:space="preserve"> </w:t>
+      </w:r>
+      <w:r>
+        <w:rPr>
+          <w:rStyle w:val="VerbatimChar"/>
+        </w:rPr>
+        <w:t xml:space="preserve">options(scipen=VALUE)</w:t>
+      </w:r>
+      <w:r>
+        <w:t xml:space="preserve"> </w:t>
+      </w:r>
+      <w:r>
+        <w:t xml:space="preserve">to encourage R to use or not use scientific notation (the higher the value, the less likely R is to use scientific notation) and</w:t>
+      </w:r>
+      <w:r>
+        <w:t xml:space="preserve"> </w:t>
+      </w:r>
+      <w:r>
+        <w:rPr>
+          <w:rStyle w:val="VerbatimChar"/>
+        </w:rPr>
+        <w:t xml:space="preserve">options(digits=VALUE)</w:t>
+      </w:r>
+      <w:r>
+        <w:t xml:space="preserve"> </w:t>
+      </w:r>
+      <w:r>
+        <w:t xml:space="preserve">to encourage R to round to a certain number of digits.</w:t>
+      </w:r>
+    </w:p>
+    <w:p>
+      <w:pPr>
+        <w:pStyle w:val="Compact"/>
+        <w:numPr>
+          <w:ilvl w:val="0"/>
+          <w:numId w:val="1001"/>
+        </w:numPr>
+      </w:pPr>
+      <w:r>
+        <w:t xml:space="preserve">Integrate your answers in this Word document.</w:t>
+      </w:r>
+      <w:r>
+        <w:br/>
+      </w:r>
+    </w:p>
+    <w:p>
+      <w:pPr>
+        <w:pStyle w:val="Compact"/>
+        <w:numPr>
+          <w:ilvl w:val="0"/>
+          <w:numId w:val="1001"/>
+        </w:numPr>
+      </w:pPr>
+      <w:r>
+        <w:t xml:space="preserve">For any problem asking you to carry out an operation in R, copy and paste your syntax and any R output below the respective question.</w:t>
+      </w:r>
+    </w:p>
+    <w:p>
+      <w:pPr>
+        <w:pStyle w:val="Compact"/>
+        <w:numPr>
+          <w:ilvl w:val="0"/>
+          <w:numId w:val="1001"/>
+        </w:numPr>
+      </w:pPr>
+      <w:r>
+        <w:t xml:space="preserve">For questions that ask you to do manual calculations, you should show your work. Using R for manual calculations is allowed and encouraged (show your R syntax and output).</w:t>
+      </w:r>
+    </w:p>
+    <w:p>
+      <w:pPr>
+        <w:pStyle w:val="Compact"/>
+        <w:numPr>
+          <w:ilvl w:val="0"/>
+          <w:numId w:val="1001"/>
+        </w:numPr>
+      </w:pPr>
+      <w:r>
+        <w:t xml:space="preserve">For each lab assignment, you should maintain an organized organized syntax file (</w:t>
+      </w:r>
+      <w:r>
+        <w:t xml:space="preserve">“</w:t>
+      </w:r>
+      <w:r>
+        <w:t xml:space="preserve">script</w:t>
+      </w:r>
+      <w:r>
+        <w:t xml:space="preserve">”</w:t>
+      </w:r>
+      <w:r>
+        <w:t xml:space="preserve">)</w:t>
+      </w:r>
+    </w:p>
+    <w:p>
+      <w:pPr>
+        <w:pStyle w:val="Compact"/>
+        <w:numPr>
+          <w:ilvl w:val="1"/>
+          <w:numId w:val="1002"/>
+        </w:numPr>
+      </w:pPr>
+      <w:r>
+        <w:t xml:space="preserve">With comments prefaced by</w:t>
+      </w:r>
+      <w:r>
+        <w:t xml:space="preserve"> </w:t>
+      </w:r>
+      <w:r>
+        <w:rPr>
+          <w:rStyle w:val="VerbatimChar"/>
+        </w:rPr>
+        <w:t xml:space="preserve">#</w:t>
+      </w:r>
+      <w:r>
+        <w:t xml:space="preserve"> </w:t>
+      </w:r>
+      <w:r>
+        <w:t xml:space="preserve">that explain what you are doing</w:t>
+      </w:r>
+    </w:p>
+    <w:p>
+      <w:pPr>
+        <w:pStyle w:val="Compact"/>
+        <w:numPr>
+          <w:ilvl w:val="1"/>
+          <w:numId w:val="1002"/>
+        </w:numPr>
+      </w:pPr>
+      <w:r>
+        <w:t xml:space="preserve">missteps/mistakes are deleted</w:t>
+      </w:r>
+    </w:p>
+    <w:p>
+      <w:pPr>
+        <w:pStyle w:val="Compact"/>
+        <w:numPr>
+          <w:ilvl w:val="1"/>
+          <w:numId w:val="1002"/>
+        </w:numPr>
+      </w:pPr>
+      <w:r>
+        <w:t xml:space="preserve">in case you lose your work, you can run your script and reproduce your analyses.</w:t>
+      </w:r>
+    </w:p>
+    <w:p>
+      <w:pPr>
+        <w:pStyle w:val="Compact"/>
+        <w:numPr>
+          <w:ilvl w:val="1"/>
+          <w:numId w:val="1002"/>
+        </w:numPr>
+      </w:pPr>
+      <w:r>
+        <w:t xml:space="preserve">Some labs may require you to build on analyses/data cleaning you did in a prior lab and saving scripts easily allow you to do that</w:t>
+      </w:r>
+    </w:p>
+    <w:p>
+      <w:pPr>
+        <w:pStyle w:val="Compact"/>
+        <w:numPr>
+          <w:ilvl w:val="0"/>
+          <w:numId w:val="1001"/>
+        </w:numPr>
+      </w:pPr>
+      <w:r>
+        <w:t xml:space="preserve">You need to upload this document to Canvas by the deadline</w:t>
+      </w:r>
+      <w:r>
+        <w:t xml:space="preserve"> </w:t>
+      </w:r>
+      <w:r>
+        <w:rPr>
+          <w:i/>
+          <w:iCs/>
+        </w:rPr>
+        <w:t xml:space="preserve">and check Canvas to make sure your upload took</w:t>
+      </w:r>
+    </w:p>
     <w:bookmarkStart w:id="20" w:name="problem-1-0-pts"/>
     <w:p>
       <w:pPr>
@@ -359,119 +545,6 @@
       </w:pPr>
       <w:r>
         <w:t xml:space="preserve">Output:</w:t>
-      </w:r>
-    </w:p>
-    <w:p>
-      <w:pPr>
-        <w:pStyle w:val="SourceCode"/>
-      </w:pPr>
-      <w:r>
-        <w:rPr>
-          <w:rStyle w:val="VerbatimChar"/>
-        </w:rPr>
-        <w:t xml:space="preserve">## Warning: package 'labelled' was built under R version 4.3.3</w:t>
-      </w:r>
-    </w:p>
-    <w:p>
-      <w:pPr>
-        <w:pStyle w:val="SourceCode"/>
-      </w:pPr>
-      <w:r>
-        <w:rPr>
-          <w:rStyle w:val="VerbatimChar"/>
-        </w:rPr>
-        <w:t xml:space="preserve">## Warning: package 'psych' was built under R version 4.3.3</w:t>
-      </w:r>
-    </w:p>
-    <w:p>
-      <w:pPr>
-        <w:pStyle w:val="SourceCode"/>
-      </w:pPr>
-      <w:r>
-        <w:rPr>
-          <w:rStyle w:val="VerbatimChar"/>
-        </w:rPr>
-        <w:t xml:space="preserve">## </w:t>
-      </w:r>
-      <w:r>
-        <w:br/>
-      </w:r>
-      <w:r>
-        <w:rPr>
-          <w:rStyle w:val="VerbatimChar"/>
-        </w:rPr>
-        <w:t xml:space="preserve">## Attaching package: 'psych'</w:t>
-      </w:r>
-    </w:p>
-    <w:p>
-      <w:pPr>
-        <w:pStyle w:val="SourceCode"/>
-      </w:pPr>
-      <w:r>
-        <w:rPr>
-          <w:rStyle w:val="VerbatimChar"/>
-        </w:rPr>
-        <w:t xml:space="preserve">## The following objects are masked from 'package:ggplot2':</w:t>
-      </w:r>
-      <w:r>
-        <w:br/>
-      </w:r>
-      <w:r>
-        <w:rPr>
-          <w:rStyle w:val="VerbatimChar"/>
-        </w:rPr>
-        <w:t xml:space="preserve">## </w:t>
-      </w:r>
-      <w:r>
-        <w:br/>
-      </w:r>
-      <w:r>
-        <w:rPr>
-          <w:rStyle w:val="VerbatimChar"/>
-        </w:rPr>
-        <w:t xml:space="preserve">##     %+%, alpha</w:t>
-      </w:r>
-    </w:p>
-    <w:p>
-      <w:pPr>
-        <w:pStyle w:val="SourceCode"/>
-      </w:pPr>
-      <w:r>
-        <w:rPr>
-          <w:rStyle w:val="VerbatimChar"/>
-        </w:rPr>
-        <w:t xml:space="preserve">## </w:t>
-      </w:r>
-      <w:r>
-        <w:br/>
-      </w:r>
-      <w:r>
-        <w:rPr>
-          <w:rStyle w:val="VerbatimChar"/>
-        </w:rPr>
-        <w:t xml:space="preserve">## Please cite as:</w:t>
-      </w:r>
-    </w:p>
-    <w:p>
-      <w:pPr>
-        <w:pStyle w:val="SourceCode"/>
-      </w:pPr>
-      <w:r>
-        <w:rPr>
-          <w:rStyle w:val="VerbatimChar"/>
-        </w:rPr>
-        <w:t xml:space="preserve">##  Hlavac, Marek (2022). stargazer: Well-Formatted Regression and Summary Statistics Tables.</w:t>
-      </w:r>
-    </w:p>
-    <w:p>
-      <w:pPr>
-        <w:pStyle w:val="SourceCode"/>
-      </w:pPr>
-      <w:r>
-        <w:rPr>
-          <w:rStyle w:val="VerbatimChar"/>
-        </w:rPr>
-        <w:t xml:space="preserve">##  R package version 5.2.3. https://CRAN.R-project.org/package=stargazer</w:t>
       </w:r>
     </w:p>
     <w:bookmarkEnd w:id="20"/>
@@ -3106,65 +3179,7 @@
     </w:p>
     <w:p>
       <w:pPr>
-        <w:pStyle w:val="SourceCode"/>
-      </w:pPr>
-      <w:r>
-        <w:rPr>
-          <w:rStyle w:val="VerbatimChar"/>
-        </w:rPr>
-        <w:t xml:space="preserve">## Warning: The dot-dot notation (`..count..`) was deprecated in ggplot2 3.4.0.</w:t>
-      </w:r>
-      <w:r>
-        <w:br/>
-      </w:r>
-      <w:r>
-        <w:rPr>
-          <w:rStyle w:val="VerbatimChar"/>
-        </w:rPr>
-        <w:t xml:space="preserve">## i Please use `after_stat(count)` instead.</w:t>
-      </w:r>
-      <w:r>
-        <w:br/>
-      </w:r>
-      <w:r>
-        <w:rPr>
-          <w:rStyle w:val="VerbatimChar"/>
-        </w:rPr>
-        <w:t xml:space="preserve">## This warning is displayed once every 8 hours.</w:t>
-      </w:r>
-      <w:r>
-        <w:br/>
-      </w:r>
-      <w:r>
-        <w:rPr>
-          <w:rStyle w:val="VerbatimChar"/>
-        </w:rPr>
-        <w:t xml:space="preserve">## Call `lifecycle::last_lifecycle_warnings()` to see where this warning was</w:t>
-      </w:r>
-      <w:r>
-        <w:br/>
-      </w:r>
-      <w:r>
-        <w:rPr>
-          <w:rStyle w:val="VerbatimChar"/>
-        </w:rPr>
-        <w:t xml:space="preserve">## generated.</w:t>
-      </w:r>
-    </w:p>
-    <w:p>
-      <w:pPr>
-        <w:pStyle w:val="SourceCode"/>
-      </w:pPr>
-      <w:r>
-        <w:rPr>
-          <w:rStyle w:val="VerbatimChar"/>
-        </w:rPr>
-        <w:t xml:space="preserve">## `stat_bin()` using `bins = 30`. Pick better value with `binwidth`.</w:t>
-      </w:r>
-    </w:p>
-    <w:p>
-      <w:pPr>
-        <w:pStyle w:val="FirstParagraph"/>
+        <w:pStyle w:val="BodyText"/>
       </w:pPr>
       <w:r>
         <w:drawing>
@@ -3211,18 +3226,7 @@
     </w:p>
     <w:p>
       <w:pPr>
-        <w:pStyle w:val="SourceCode"/>
-      </w:pPr>
-      <w:r>
-        <w:rPr>
-          <w:rStyle w:val="VerbatimChar"/>
-        </w:rPr>
-        <w:t xml:space="preserve">## `stat_bin()` using `bins = 30`. Pick better value with `binwidth`.</w:t>
-      </w:r>
-    </w:p>
-    <w:p>
-      <w:pPr>
-        <w:pStyle w:val="FirstParagraph"/>
+        <w:pStyle w:val="BodyText"/>
       </w:pPr>
       <w:r>
         <w:drawing>
@@ -3269,18 +3273,7 @@
     </w:p>
     <w:p>
       <w:pPr>
-        <w:pStyle w:val="SourceCode"/>
-      </w:pPr>
-      <w:r>
-        <w:rPr>
-          <w:rStyle w:val="VerbatimChar"/>
-        </w:rPr>
-        <w:t xml:space="preserve">## `stat_bin()` using `bins = 30`. Pick better value with `binwidth`.</w:t>
-      </w:r>
-    </w:p>
-    <w:p>
-      <w:pPr>
-        <w:pStyle w:val="FirstParagraph"/>
+        <w:pStyle w:val="BodyText"/>
       </w:pPr>
       <w:r>
         <w:drawing>
@@ -3834,7 +3827,7 @@
       </w:r>
     </w:p>
     <w:bookmarkEnd w:id="38"/>
-    <w:bookmarkStart w:id="39" w:name="problem-11-5-pts"/>
+    <w:bookmarkStart w:id="40" w:name="problem-11-5-pts"/>
     <w:p>
       <w:pPr>
         <w:pStyle w:val="Heading2"/>
@@ -3919,13 +3912,60 @@
         <w:rPr>
           <w:rStyle w:val="VerbatimChar"/>
         </w:rPr>
-        <w:t xml:space="preserve">type = "text"</w:t>
-      </w:r>
-      <w:r>
-        <w:t xml:space="preserve"> </w:t>
-      </w:r>
-      <w:r>
-        <w:t xml:space="preserve">option and then adding options one at a time to see how they affect your table.</w:t>
+        <w:t xml:space="preserve">type="text"</w:t>
+      </w:r>
+      <w:r>
+        <w:t xml:space="preserve"> </w:t>
+      </w:r>
+      <w:r>
+        <w:t xml:space="preserve">option and then adding the options one at a time to see how they affect your table. You should be especially careful with</w:t>
+      </w:r>
+      <w:r>
+        <w:t xml:space="preserve"> </w:t>
+      </w:r>
+      <w:r>
+        <w:rPr>
+          <w:rStyle w:val="VerbatimChar"/>
+        </w:rPr>
+        <w:t xml:space="preserve">covariate.labels</w:t>
+      </w:r>
+      <w:r>
+        <w:t xml:space="preserve"> </w:t>
+      </w:r>
+      <w:r>
+        <w:t xml:space="preserve">as you do NOT want to mislabel your predictors. If you have questions about the</w:t>
+      </w:r>
+      <w:r>
+        <w:t xml:space="preserve"> </w:t>
+      </w:r>
+      <w:r>
+        <w:rPr>
+          <w:rStyle w:val="VerbatimChar"/>
+        </w:rPr>
+        <w:t xml:space="preserve">stargazer</w:t>
+      </w:r>
+      <w:r>
+        <w:t xml:space="preserve"> </w:t>
+      </w:r>
+      <w:r>
+        <w:t xml:space="preserve">syntax the</w:t>
+      </w:r>
+      <w:r>
+        <w:t xml:space="preserve"> </w:t>
+      </w:r>
+      <w:hyperlink r:id="rId39">
+        <w:r>
+          <w:rPr>
+            <w:rStyle w:val="Hyperlink"/>
+          </w:rPr>
+          <w:t xml:space="preserve">documentation</w:t>
+        </w:r>
+      </w:hyperlink>
+      <w:r>
+        <w:t xml:space="preserve"> </w:t>
+      </w:r>
+      <w:r>
+        <w:t xml:space="preserve">is helpful.</w:t>
       </w:r>
     </w:p>
     <w:p>
@@ -4650,8 +4690,8 @@
         <w:t xml:space="preserve">## Note:                                 Stars: * p&lt;.05; ** p&lt;.01; *** p&lt;.001</w:t>
       </w:r>
     </w:p>
-    <w:bookmarkEnd w:id="39"/>
-    <w:bookmarkStart w:id="40" w:name="problemn-12-4-pts"/>
+    <w:bookmarkEnd w:id="40"/>
+    <w:bookmarkStart w:id="41" w:name="problemn-12-4-pts"/>
     <w:p>
       <w:pPr>
         <w:pStyle w:val="Heading2"/>
@@ -4708,8 +4748,8 @@
         <w:t xml:space="preserve">Model 2 (children): When there are 0 household members under 18, the predicted spring kindergarten reading score is 54.222 points.</w:t>
       </w:r>
     </w:p>
-    <w:bookmarkEnd w:id="40"/>
-    <w:bookmarkStart w:id="41" w:name="problem-13-4-pts"/>
+    <w:bookmarkEnd w:id="41"/>
+    <w:bookmarkStart w:id="42" w:name="problem-13-4-pts"/>
     <w:p>
       <w:pPr>
         <w:pStyle w:val="Heading2"/>
@@ -4814,8 +4854,8 @@
         <w:t xml:space="preserve">.</w:t>
       </w:r>
     </w:p>
-    <w:bookmarkEnd w:id="41"/>
-    <w:bookmarkStart w:id="42" w:name="problem-14-4-pts"/>
+    <w:bookmarkEnd w:id="42"/>
+    <w:bookmarkStart w:id="43" w:name="problem-14-4-pts"/>
     <w:p>
       <w:pPr>
         <w:pStyle w:val="Heading2"/>
@@ -4829,16 +4869,13 @@
         <w:pStyle w:val="FirstParagraph"/>
       </w:pPr>
       <w:r>
-        <w:t xml:space="preserve">Give a textbook interpretation of the</w:t>
-      </w:r>
-      <w:r>
-        <w:t xml:space="preserve"> </w:t>
-      </w:r>
-      <w:r>
-        <w:rPr>
-          <w:rStyle w:val="VerbatimChar"/>
-        </w:rPr>
-        <w:t xml:space="preserve">R^2</w:t>
+        <w:t xml:space="preserve">Give a textbook interpretation of the r</w:t>
+      </w:r>
+      <w:r>
+        <w:rPr>
+          <w:vertAlign w:val="superscript"/>
+        </w:rPr>
+        <w:t xml:space="preserve">2</w:t>
       </w:r>
       <w:r>
         <w:t xml:space="preserve"> </w:t>
@@ -4911,8 +4948,8 @@
         <w:t xml:space="preserve">, so number of household members under 18 explains 2.51% of variation in spring kindergarten reading scores.</w:t>
       </w:r>
     </w:p>
-    <w:bookmarkEnd w:id="42"/>
-    <w:bookmarkStart w:id="43" w:name="problem-15-2-pts"/>
+    <w:bookmarkEnd w:id="43"/>
+    <w:bookmarkStart w:id="44" w:name="problem-15-2-pts"/>
     <w:p>
       <w:pPr>
         <w:pStyle w:val="Heading2"/>
@@ -5419,8 +5456,8 @@
         <w:t xml:space="preserve">## F-statistic:  450 on 1 and 17486 DF,  p-value: &lt;0.0000000000000002</w:t>
       </w:r>
     </w:p>
-    <w:bookmarkEnd w:id="43"/>
-    <w:bookmarkStart w:id="44" w:name="problem-16-2-pt"/>
+    <w:bookmarkEnd w:id="44"/>
+    <w:bookmarkStart w:id="45" w:name="problem-16-2-pt"/>
     <w:p>
       <w:pPr>
         <w:pStyle w:val="Heading2"/>
@@ -6174,8 +6211,8 @@
         <w:t xml:space="preserve">## Note:                                      Stars: * p&lt;.05; ** p&lt;.01; *** p&lt;.001</w:t>
       </w:r>
     </w:p>
-    <w:bookmarkEnd w:id="44"/>
-    <w:bookmarkStart w:id="45" w:name="problem-17-2-pts"/>
+    <w:bookmarkEnd w:id="45"/>
+    <w:bookmarkStart w:id="46" w:name="problem-17-2-pts"/>
     <w:p>
       <w:pPr>
         <w:pStyle w:val="Heading2"/>
@@ -6233,8 +6270,8 @@
         <w:t xml:space="preserve">), predicted reading score is 0.0235 SD above the mean.</w:t>
       </w:r>
     </w:p>
-    <w:bookmarkEnd w:id="45"/>
-    <w:bookmarkStart w:id="46" w:name="problem-18-2-pts"/>
+    <w:bookmarkEnd w:id="46"/>
+    <w:bookmarkStart w:id="47" w:name="problem-18-2-pts"/>
     <w:p>
       <w:pPr>
         <w:pStyle w:val="Heading2"/>
@@ -6307,8 +6344,8 @@
         <w:t xml:space="preserve">.</w:t>
       </w:r>
     </w:p>
-    <w:bookmarkEnd w:id="46"/>
-    <w:bookmarkStart w:id="47" w:name="problem-19-2-pts"/>
+    <w:bookmarkEnd w:id="47"/>
+    <w:bookmarkStart w:id="48" w:name="problem-19-2-pts"/>
     <w:p>
       <w:pPr>
         <w:pStyle w:val="Heading2"/>
@@ -6701,8 +6738,8 @@
         <w:t xml:space="preserve">## F-statistic:  450 on 1 and 17486 DF,  p-value: &lt;0.0000000000000002</w:t>
       </w:r>
     </w:p>
-    <w:bookmarkEnd w:id="47"/>
-    <w:bookmarkStart w:id="48" w:name="problem-20-6-pts"/>
+    <w:bookmarkEnd w:id="48"/>
+    <w:bookmarkStart w:id="49" w:name="problem-20-6-pts"/>
     <w:p>
       <w:pPr>
         <w:pStyle w:val="Heading2"/>
@@ -6895,8 +6932,8 @@
         <w:t xml:space="preserve">.</w:t>
       </w:r>
     </w:p>
-    <w:bookmarkEnd w:id="48"/>
-    <w:bookmarkStart w:id="49" w:name="problem-21-0-pts"/>
+    <w:bookmarkEnd w:id="49"/>
+    <w:bookmarkStart w:id="50" w:name="problem-21-0-pts"/>
     <w:p>
       <w:pPr>
         <w:pStyle w:val="Heading2"/>
@@ -6945,7 +6982,7 @@
         <w:t xml:space="preserve">N/A</w:t>
       </w:r>
     </w:p>
-    <w:bookmarkEnd w:id="49"/>
+    <w:bookmarkEnd w:id="50"/>
     <w:sectPr>
       <w:headerReference r:id="rId9" w:type="default"/>
       <w:footerReference r:id="rId10" w:type="default"/>
@@ -7213,11 +7250,93 @@
       </w:pPr>
     </w:lvl>
   </w:abstractNum>
+  <w:abstractNum w:abstractNumId="991">
+    <w:nsid w:val="0000A991"/>
+    <w:multiLevelType w:val="multilevel"/>
+    <w:lvl w:ilvl="0">
+      <w:numFmt w:val="bullet"/>
+      <w:lvlText w:val="•"/>
+      <w:lvlJc w:val="left"/>
+      <w:pPr>
+        <w:ind w:left="720" w:hanging="480"/>
+      </w:pPr>
+    </w:lvl>
+    <w:lvl w:ilvl="1">
+      <w:numFmt w:val="bullet"/>
+      <w:lvlText w:val="–"/>
+      <w:lvlJc w:val="left"/>
+      <w:pPr>
+        <w:ind w:left="1440" w:hanging="480"/>
+      </w:pPr>
+    </w:lvl>
+    <w:lvl w:ilvl="2">
+      <w:numFmt w:val="bullet"/>
+      <w:lvlText w:val="•"/>
+      <w:lvlJc w:val="left"/>
+      <w:pPr>
+        <w:ind w:left="2160" w:hanging="480"/>
+      </w:pPr>
+    </w:lvl>
+    <w:lvl w:ilvl="3">
+      <w:numFmt w:val="bullet"/>
+      <w:lvlText w:val="–"/>
+      <w:lvlJc w:val="left"/>
+      <w:pPr>
+        <w:ind w:left="2880" w:hanging="480"/>
+      </w:pPr>
+    </w:lvl>
+    <w:lvl w:ilvl="4">
+      <w:numFmt w:val="bullet"/>
+      <w:lvlText w:val="•"/>
+      <w:lvlJc w:val="left"/>
+      <w:pPr>
+        <w:ind w:left="3600" w:hanging="480"/>
+      </w:pPr>
+    </w:lvl>
+    <w:lvl w:ilvl="5">
+      <w:numFmt w:val="bullet"/>
+      <w:lvlText w:val="–"/>
+      <w:lvlJc w:val="left"/>
+      <w:pPr>
+        <w:ind w:left="4320" w:hanging="480"/>
+      </w:pPr>
+    </w:lvl>
+    <w:lvl w:ilvl="6">
+      <w:numFmt w:val="bullet"/>
+      <w:lvlText w:val="•"/>
+      <w:lvlJc w:val="left"/>
+      <w:pPr>
+        <w:ind w:left="5040" w:hanging="480"/>
+      </w:pPr>
+    </w:lvl>
+    <w:lvl w:ilvl="7">
+      <w:numFmt w:val="bullet"/>
+      <w:lvlText w:val="–"/>
+      <w:lvlJc w:val="left"/>
+      <w:pPr>
+        <w:ind w:left="5760" w:hanging="480"/>
+      </w:pPr>
+    </w:lvl>
+    <w:lvl w:ilvl="8">
+      <w:numFmt w:val="bullet"/>
+      <w:lvlText w:val="•"/>
+      <w:lvlJc w:val="left"/>
+      <w:pPr>
+        <w:ind w:left="6480" w:hanging="480"/>
+      </w:pPr>
+    </w:lvl>
+  </w:abstractNum>
   <w:num w16cid:durableId="1356274576" w:numId="1">
     <w:abstractNumId w:val="0"/>
   </w:num>
   <w:num w:numId="1000">
     <w:abstractNumId w:val="990"/>
+  </w:num>
+  <w:num w:numId="1001">
+    <w:abstractNumId w:val="991"/>
+  </w:num>
+  <w:num w:numId="1002">
+    <w:abstractNumId w:val="991"/>
   </w:num>
 </w:numbering>
 </file>

</xml_diff>